<commit_message>
docs(dp): align with official template (accents, official labels, jury boilerplate)
</commit_message>
<xml_diff>
--- a/documentation/DP_Loic_NANZO_TONLIEU_ASD.docx
+++ b/documentation/DP_Loic_NANZO_TONLIEU_ASD.docx
@@ -142,7 +142,7 @@
                 <w:sz w:val="20"/>
                 <w:szCs w:val="20"/>
               </w:rPr>
-              <w:t xml:space="preserve">Prenom</w:t>
+              <w:t xml:space="preserve">Prénom</w:t>
             </w:r>
           </w:p>
           <w:p>
@@ -235,7 +235,7 @@
                 <w:sz w:val="20"/>
                 <w:szCs w:val="20"/>
               </w:rPr>
-              <w:t xml:space="preserve">Loic</w:t>
+              <w:t xml:space="preserve">Loïc</w:t>
             </w:r>
           </w:p>
           <w:p>
@@ -254,7 +254,7 @@
                 <w:sz w:val="20"/>
                 <w:szCs w:val="20"/>
               </w:rPr>
-              <w:t xml:space="preserve">Orleans (45)</w:t>
+              <w:t xml:space="preserve">Orléans (45)</w:t>
             </w:r>
           </w:p>
         </w:tc>
@@ -333,7 +333,7 @@
                 <w:sz w:val="26"/>
                 <w:szCs w:val="26"/>
               </w:rPr>
-              <w:t xml:space="preserve">Titre professionnel vise</w:t>
+              <w:t xml:space="preserve">Titre professionnel visé</w:t>
             </w:r>
           </w:p>
         </w:tc>
@@ -361,7 +361,7 @@
           <w:sz w:val="28"/>
           <w:szCs w:val="28"/>
         </w:rPr>
-        <w:t xml:space="preserve">Administrateur Systeme DevOps</w:t>
+        <w:t xml:space="preserve">Administrateur Système DevOps</w:t>
       </w:r>
     </w:p>
     <w:p>
@@ -442,7 +442,7 @@
                 <w:sz w:val="22"/>
                 <w:szCs w:val="22"/>
               </w:rPr>
-              <w:t xml:space="preserve">MODALITE D'ACCES :</w:t>
+              <w:t xml:space="preserve">MODALITÉ D'ACCÈS :</w:t>
             </w:r>
           </w:p>
           <w:p>
@@ -455,7 +455,7 @@
                 <w:sz w:val="20"/>
                 <w:szCs w:val="20"/>
               </w:rPr>
-              <w:t xml:space="preserve">[ ]  Validation des Acquis de l'Experience (VAE)</w:t>
+              <w:t xml:space="preserve">☐  Validation des Acquis de l'Expérience (VAE)</w:t>
             </w:r>
           </w:p>
           <w:p>
@@ -468,7 +468,7 @@
                 <w:sz w:val="20"/>
                 <w:szCs w:val="20"/>
               </w:rPr>
-              <w:t xml:space="preserve">[X]  Parcours de formation</w:t>
+              <w:t xml:space="preserve">☑  Parcours de formation</w:t>
             </w:r>
           </w:p>
         </w:tc>
@@ -534,7 +534,7 @@
                 <w:sz w:val="24"/>
                 <w:szCs w:val="24"/>
               </w:rPr>
-              <w:t xml:space="preserve">Presentation du dossier</w:t>
+              <w:t xml:space="preserve">Présentation du dossier</w:t>
             </w:r>
           </w:p>
         </w:tc>
@@ -598,7 +598,7 @@
                 <w:sz w:val="20"/>
                 <w:szCs w:val="20"/>
               </w:rPr>
-              <w:t xml:space="preserve">Le dossier professionnel (DP) constitue un element du systeme de validation du titre professionnel, </w:t>
+              <w:t xml:space="preserve">Le dossier professionnel (DP) constitue un élément du système de validation du titre professionnel. </w:t>
             </w:r>
             <w:r>
               <w:rPr>
@@ -611,12 +611,12 @@
                 <w:sz w:val="20"/>
                 <w:szCs w:val="20"/>
               </w:rPr>
-              <w:t xml:space="preserve">delivre par le Ministere charge de l'emploi.</w:t>
-            </w:r>
-          </w:p>
-          <w:p>
-            <w:pPr>
-              <w:spacing w:after="60" w:before="0"/>
+              <w:t xml:space="preserve">Ce titre est délivré par le Ministère chargé de l'emploi.</w:t>
+            </w:r>
+          </w:p>
+          <w:p>
+            <w:pPr>
+              <w:spacing w:after="100" w:before="0"/>
               <w:jc w:val="left"/>
             </w:pPr>
             <w:r>
@@ -630,7 +630,7 @@
                 <w:sz w:val="20"/>
                 <w:szCs w:val="20"/>
               </w:rPr>
-              <w:t xml:space="preserve">Il regroupe, pour chaque activite-type du titre, des exemples concrets de ma pratique professionnelle, issus de </w:t>
+              <w:t xml:space="preserve">Le DP appartient au candidat. Il le conserve, l'actualise durant son parcours et le présente </w:t>
             </w:r>
             <w:r>
               <w:rPr>
@@ -643,8 +643,14 @@
                 <w:sz w:val="20"/>
                 <w:szCs w:val="20"/>
               </w:rPr>
-              <w:t xml:space="preserve">projets personnels, associatifs et de formation</w:t>
-            </w:r>
+              <w:t xml:space="preserve">obligatoirement à chaque session d'examen.</w:t>
+            </w:r>
+          </w:p>
+          <w:p>
+            <w:pPr>
+              <w:spacing w:after="100" w:before="0"/>
+              <w:jc w:val="left"/>
+            </w:pPr>
             <w:r>
               <w:rPr>
                 <w:rFonts w:ascii="Arial" w:cs="Arial" w:eastAsia="Arial" w:hAnsi="Arial"/>
@@ -656,12 +662,131 @@
                 <w:sz w:val="20"/>
                 <w:szCs w:val="20"/>
               </w:rPr>
-              <w:t xml:space="preserve">, au-dela du projet presente au titre.</w:t>
+              <w:t xml:space="preserve">Pour rédiger le DP, le candidat peut être aidé par un formateur ou par un accompagnateur VAE.</w:t>
+            </w:r>
+          </w:p>
+          <w:p>
+            <w:pPr>
+              <w:spacing w:after="60" w:before="0"/>
+              <w:jc w:val="left"/>
+            </w:pPr>
+            <w:r>
+              <w:rPr>
+                <w:rFonts w:ascii="Arial" w:cs="Arial" w:eastAsia="Arial" w:hAnsi="Arial"/>
+                <w:b w:val="false"/>
+                <w:bCs w:val="false"/>
+                <w:i w:val="false"/>
+                <w:iCs w:val="false"/>
+                <w:color w:val="000000"/>
+                <w:sz w:val="20"/>
+                <w:szCs w:val="20"/>
+              </w:rPr>
+              <w:t xml:space="preserve">Il est consulté par le jury au moment de la session d'examen.</w:t>
             </w:r>
           </w:p>
         </w:tc>
       </w:tr>
     </w:tbl>
+    <w:p>
+      <w:r>
+        <w:rPr>
+          <w:sz w:val="20"/>
+          <w:szCs w:val="20"/>
+        </w:rPr>
+        <w:t xml:space="preserve"/>
+      </w:r>
+    </w:p>
+    <w:p>
+      <w:pPr>
+        <w:spacing w:after="60" w:before="0"/>
+        <w:jc w:val="left"/>
+      </w:pPr>
+      <w:r>
+        <w:rPr>
+          <w:rFonts w:ascii="Arial" w:cs="Arial" w:eastAsia="Arial" w:hAnsi="Arial"/>
+          <w:b/>
+          <w:bCs/>
+          <w:i w:val="false"/>
+          <w:iCs w:val="false"/>
+          <w:color w:val="000000"/>
+          <w:sz w:val="20"/>
+          <w:szCs w:val="20"/>
+        </w:rPr>
+        <w:t xml:space="preserve">Pour prendre sa décision, le jury dispose :</w:t>
+      </w:r>
+    </w:p>
+    <w:p>
+      <w:pPr>
+        <w:pStyle w:val="ListParagraph"/>
+        <w:numPr>
+          <w:ilvl w:val="0"/>
+          <w:numId w:val="2"/>
+        </w:numPr>
+        <w:spacing w:after="60" w:before="0"/>
+      </w:pPr>
+      <w:r>
+        <w:rPr>
+          <w:rFonts w:ascii="Arial" w:cs="Arial" w:eastAsia="Arial" w:hAnsi="Arial"/>
+          <w:sz w:val="20"/>
+          <w:szCs w:val="20"/>
+        </w:rPr>
+        <w:t xml:space="preserve">des résultats de la mise en situation professionnelle complétés, éventuellement, du questionnaire professionnel ou de l'entretien professionnel ou de l'entretien technique ou du questionnement à partir de productions ;</w:t>
+      </w:r>
+    </w:p>
+    <w:p>
+      <w:pPr>
+        <w:pStyle w:val="ListParagraph"/>
+        <w:numPr>
+          <w:ilvl w:val="0"/>
+          <w:numId w:val="2"/>
+        </w:numPr>
+        <w:spacing w:after="60" w:before="0"/>
+      </w:pPr>
+      <w:r>
+        <w:rPr>
+          <w:rFonts w:ascii="Arial" w:cs="Arial" w:eastAsia="Arial" w:hAnsi="Arial"/>
+          <w:sz w:val="20"/>
+          <w:szCs w:val="20"/>
+        </w:rPr>
+        <w:t xml:space="preserve">du Dossier Professionnel (DP) dans lequel le candidat a consigné les preuves de sa pratique professionnelle ;</w:t>
+      </w:r>
+    </w:p>
+    <w:p>
+      <w:pPr>
+        <w:pStyle w:val="ListParagraph"/>
+        <w:numPr>
+          <w:ilvl w:val="0"/>
+          <w:numId w:val="2"/>
+        </w:numPr>
+        <w:spacing w:after="60" w:before="0"/>
+      </w:pPr>
+      <w:r>
+        <w:rPr>
+          <w:rFonts w:ascii="Arial" w:cs="Arial" w:eastAsia="Arial" w:hAnsi="Arial"/>
+          <w:sz w:val="20"/>
+          <w:szCs w:val="20"/>
+        </w:rPr>
+        <w:t xml:space="preserve">des résultats des évaluations passées en cours de formation lorsque le candidat évalué est issu d'un parcours de formation ;</w:t>
+      </w:r>
+    </w:p>
+    <w:p>
+      <w:pPr>
+        <w:pStyle w:val="ListParagraph"/>
+        <w:numPr>
+          <w:ilvl w:val="0"/>
+          <w:numId w:val="2"/>
+        </w:numPr>
+        <w:spacing w:after="60" w:before="0"/>
+      </w:pPr>
+      <w:r>
+        <w:rPr>
+          <w:rFonts w:ascii="Arial" w:cs="Arial" w:eastAsia="Arial" w:hAnsi="Arial"/>
+          <w:sz w:val="20"/>
+          <w:szCs w:val="20"/>
+        </w:rPr>
+        <w:t xml:space="preserve">de l'entretien final (dans le cadre de la session titre).</w:t>
+      </w:r>
+    </w:p>
     <w:p>
       <w:r>
         <w:rPr>
@@ -695,7 +820,7 @@
         <w:pStyle w:val="ListParagraph"/>
         <w:numPr>
           <w:ilvl w:val="0"/>
-          <w:numId w:val="2"/>
+          <w:numId w:val="3"/>
         </w:numPr>
         <w:spacing w:after="40" w:before="0"/>
       </w:pPr>
@@ -705,7 +830,7 @@
           <w:sz w:val="20"/>
           <w:szCs w:val="20"/>
         </w:rPr>
-        <w:t xml:space="preserve">pour chaque activite-type du titre vise, un a trois exemples de pratique professionnelle ;</w:t>
+        <w:t xml:space="preserve">pour chaque activité-type du titre visé, un à trois exemples de pratique professionnelle ;</w:t>
       </w:r>
     </w:p>
     <w:p>
@@ -713,7 +838,7 @@
         <w:pStyle w:val="ListParagraph"/>
         <w:numPr>
           <w:ilvl w:val="0"/>
-          <w:numId w:val="2"/>
+          <w:numId w:val="3"/>
         </w:numPr>
         <w:spacing w:after="40" w:before="0"/>
       </w:pPr>
@@ -723,7 +848,7 @@
           <w:sz w:val="20"/>
           <w:szCs w:val="20"/>
         </w:rPr>
-        <w:t xml:space="preserve">un tableau des titres, diplomes et certifications ;</w:t>
+        <w:t xml:space="preserve">un tableau à renseigner pour la détention d'un titre, d'un diplôme ou d'une certification ;</w:t>
       </w:r>
     </w:p>
     <w:p>
@@ -731,7 +856,7 @@
         <w:pStyle w:val="ListParagraph"/>
         <w:numPr>
           <w:ilvl w:val="0"/>
-          <w:numId w:val="2"/>
+          <w:numId w:val="3"/>
         </w:numPr>
         <w:spacing w:after="40" w:before="0"/>
       </w:pPr>
@@ -741,7 +866,7 @@
           <w:sz w:val="20"/>
           <w:szCs w:val="20"/>
         </w:rPr>
-        <w:t xml:space="preserve">une declaration sur l'honneur ;</w:t>
+        <w:t xml:space="preserve">une déclaration sur l'honneur à compléter et à signer ;</w:t>
       </w:r>
     </w:p>
     <w:p>
@@ -749,7 +874,7 @@
         <w:pStyle w:val="ListParagraph"/>
         <w:numPr>
           <w:ilvl w:val="0"/>
-          <w:numId w:val="2"/>
+          <w:numId w:val="3"/>
         </w:numPr>
         <w:spacing w:after="40" w:before="0"/>
       </w:pPr>
@@ -759,7 +884,7 @@
           <w:sz w:val="20"/>
           <w:szCs w:val="20"/>
         </w:rPr>
-        <w:t xml:space="preserve">des documents illustrant la pratique professionnelle (liens GitHub).</w:t>
+        <w:t xml:space="preserve">des documents illustrant la pratique professionnelle (liens vers les dépôts de code).</w:t>
       </w:r>
     </w:p>
     <w:p>
@@ -879,7 +1004,7 @@
                 <w:sz w:val="20"/>
                 <w:szCs w:val="20"/>
               </w:rPr>
-              <w:t xml:space="preserve">Automatiser le deploiement d'une infrastructure dans le cloud</w:t>
+              <w:t xml:space="preserve">Automatiser le déploiement d'une infrastructure dans le cloud</w:t>
             </w:r>
           </w:p>
         </w:tc>
@@ -934,7 +1059,7 @@
                 <w:sz w:val="20"/>
                 <w:szCs w:val="20"/>
               </w:rPr>
-              <w:t xml:space="preserve">• Ex. 1 : dropshop — deploiement cloud AWS ECS (projet personnel)</w:t>
+              <w:t xml:space="preserve">• Ex. 1 : dropshop — déploiement cloud AWS ECS (projet personnel)</w:t>
             </w:r>
           </w:p>
           <w:p>
@@ -953,7 +1078,7 @@
                 <w:sz w:val="20"/>
                 <w:szCs w:val="20"/>
               </w:rPr>
-              <w:t xml:space="preserve">• Ex. 2 : iac-infra — provisioning Vagrant/Ansible/Terraform/K8s (projet de formation)</w:t>
+              <w:t xml:space="preserve">• Ex. 2 : iac-infra — provisioning Vagrant / Ansible / Terraform / Kubernetes (formation)</w:t>
             </w:r>
           </w:p>
         </w:tc>
@@ -1036,7 +1161,7 @@
                 <w:sz w:val="20"/>
                 <w:szCs w:val="20"/>
               </w:rPr>
-              <w:t xml:space="preserve">Deployer une application en continu</w:t>
+              <w:t xml:space="preserve">Déployer une application en continu</w:t>
             </w:r>
           </w:p>
         </w:tc>
@@ -1110,7 +1235,7 @@
                 <w:sz w:val="20"/>
                 <w:szCs w:val="20"/>
               </w:rPr>
-              <w:t xml:space="preserve">• Ex. 2 : chatbot-rag — CI/CD GitLab (tests + build Docker) (projet personnel)</w:t>
+              <w:t xml:space="preserve">• Ex. 2 : chatbot-rag — intégration continue GitLab (projet personnel)</w:t>
             </w:r>
           </w:p>
           <w:p>
@@ -1129,7 +1254,7 @@
                 <w:sz w:val="20"/>
                 <w:szCs w:val="20"/>
               </w:rPr>
-              <w:t xml:space="preserve">• Ex. 3 : avance-web — deploiement continu Vercel (projet associatif)</w:t>
+              <w:t xml:space="preserve">• Ex. 3 : avance-web — déploiement continu Vercel (projet associatif)</w:t>
             </w:r>
           </w:p>
         </w:tc>
@@ -1212,7 +1337,7 @@
                 <w:sz w:val="20"/>
                 <w:szCs w:val="20"/>
               </w:rPr>
-              <w:t xml:space="preserve">Superviser les services deployes</w:t>
+              <w:t xml:space="preserve">Superviser les services déployés</w:t>
             </w:r>
           </w:p>
         </w:tc>
@@ -1267,7 +1392,7 @@
                 <w:sz w:val="20"/>
                 <w:szCs w:val="20"/>
               </w:rPr>
-              <w:t xml:space="preserve">• Ex. 1 : iac-infra — supervision Prometheus/Grafana/Alertmanager (formation)</w:t>
+              <w:t xml:space="preserve">• Ex. 1 : iac-infra — supervision Prometheus / Grafana / Alertmanager (formation)</w:t>
             </w:r>
           </w:p>
           <w:p>
@@ -1286,7 +1411,7 @@
                 <w:sz w:val="20"/>
                 <w:szCs w:val="20"/>
               </w:rPr>
-              <w:t xml:space="preserve">• Ex. 2 : dropshop — observabilite applicative sur AWS (projet personnel)</w:t>
+              <w:t xml:space="preserve">• Ex. 2 : dropshop — observabilité applicative sur AWS (projet personnel)</w:t>
             </w:r>
           </w:p>
         </w:tc>
@@ -1326,7 +1451,7 @@
           <w:sz w:val="20"/>
           <w:szCs w:val="20"/>
         </w:rPr>
-        <w:t xml:space="preserve">Titres, diplomes, certifications</w:t>
+        <w:t xml:space="preserve">Titres, diplômes, certifications</w:t>
       </w:r>
     </w:p>
     <w:p>
@@ -1345,7 +1470,7 @@
           <w:sz w:val="20"/>
           <w:szCs w:val="20"/>
         </w:rPr>
-        <w:t xml:space="preserve">Declaration sur l'honneur</w:t>
+        <w:t xml:space="preserve">Déclaration sur l'honneur</w:t>
       </w:r>
     </w:p>
     <w:p>
@@ -1508,7 +1633,7 @@
                 <w:sz w:val="22"/>
                 <w:szCs w:val="22"/>
               </w:rPr>
-              <w:t xml:space="preserve">Activite-type : Automatiser le deploiement d'une infrastructure dans le cloud</w:t>
+              <w:t xml:space="preserve">Activité-type : Automatiser le déploiement d'une infrastructure dans le cloud</w:t>
             </w:r>
           </w:p>
         </w:tc>
@@ -1552,7 +1677,7 @@
                 <w:sz w:val="20"/>
                 <w:szCs w:val="20"/>
               </w:rPr>
-              <w:t xml:space="preserve">dropshop — Deploiement automatise sur AWS ECS Fargate (projet personnel)</w:t>
+              <w:t xml:space="preserve">dropshop — Déploiement automatisé sur AWS ECS Fargate (projet personnel)</w:t>
             </w:r>
           </w:p>
         </w:tc>
@@ -1622,7 +1747,7 @@
                 <w:sz w:val="20"/>
                 <w:szCs w:val="20"/>
               </w:rPr>
-              <w:t xml:space="preserve">1. Decrivez les taches ou operations que vous avez effectuees, et dans quelles conditions :</w:t>
+              <w:t xml:space="preserve">1. Décrivez les tâches ou opérations que vous avez effectuées, et dans quelles conditions :</w:t>
             </w:r>
           </w:p>
         </w:tc>
@@ -1677,7 +1802,7 @@
                 <w:sz w:val="20"/>
                 <w:szCs w:val="20"/>
               </w:rPr>
-              <w:t xml:space="preserve">dropshop est une application de e-commerce (dropshipping) que j'ai concue et conteneurisee en autonomie. J'ai automatise son deploiement sur une infrastructure cloud AWS :</w:t>
+              <w:t xml:space="preserve">dropshop est une application de e-commerce (dropshipping) que j'ai conçue et conteneurisée en autonomie. J'ai automatisé son déploiement sur une infrastructure cloud AWS :</w:t>
             </w:r>
           </w:p>
           <w:p>
@@ -1685,7 +1810,7 @@
               <w:pStyle w:val="ListParagraph"/>
               <w:numPr>
                 <w:ilvl w:val="0"/>
-                <w:numId w:val="2"/>
+                <w:numId w:val="3"/>
               </w:numPr>
               <w:spacing w:after="40" w:before="0"/>
             </w:pPr>
@@ -1695,7 +1820,7 @@
                 <w:sz w:val="20"/>
                 <w:szCs w:val="20"/>
               </w:rPr>
-              <w:t xml:space="preserve">Conteneurisation multi-stage (Dockerfile base / development / production) de l'application Django + Gunicorn, avec un utilisateur non-root pour la securite ;</w:t>
+              <w:t xml:space="preserve">Conteneurisation multi-étapes (Dockerfile base / development / production) de l'application Django + Gunicorn, avec un utilisateur non-root pour la sécurité ;</w:t>
             </w:r>
           </w:p>
           <w:p>
@@ -1703,7 +1828,7 @@
               <w:pStyle w:val="ListParagraph"/>
               <w:numPr>
                 <w:ilvl w:val="0"/>
-                <w:numId w:val="2"/>
+                <w:numId w:val="3"/>
               </w:numPr>
               <w:spacing w:after="40" w:before="0"/>
             </w:pPr>
@@ -1713,7 +1838,7 @@
                 <w:sz w:val="20"/>
                 <w:szCs w:val="20"/>
               </w:rPr>
-              <w:t xml:space="preserve">Orchestration de plusieurs services : application web (Django), workers asynchrones (Celery + files de taches Redis), reverse-proxy Nginx, base PostgreSQL ;</w:t>
+              <w:t xml:space="preserve">Orchestration de plusieurs services : application web (Django), workers asynchrones (Celery + files de tâches Redis), reverse-proxy Nginx, base PostgreSQL ;</w:t>
             </w:r>
           </w:p>
           <w:p>
@@ -1721,7 +1846,7 @@
               <w:pStyle w:val="ListParagraph"/>
               <w:numPr>
                 <w:ilvl w:val="0"/>
-                <w:numId w:val="2"/>
+                <w:numId w:val="3"/>
               </w:numPr>
               <w:spacing w:after="40" w:before="0"/>
             </w:pPr>
@@ -1739,7 +1864,7 @@
               <w:pStyle w:val="ListParagraph"/>
               <w:numPr>
                 <w:ilvl w:val="0"/>
-                <w:numId w:val="2"/>
+                <w:numId w:val="3"/>
               </w:numPr>
               <w:spacing w:after="40" w:before="0"/>
             </w:pPr>
@@ -1749,7 +1874,7 @@
                 <w:sz w:val="20"/>
                 <w:szCs w:val="20"/>
               </w:rPr>
-              <w:t xml:space="preserve">Deploiement sur Amazon ECS Fargate (conteneurs sans serveur a gerer), avec configuration reseau (subnets, security groups) ;</w:t>
+              <w:t xml:space="preserve">Déploiement sur Amazon ECS Fargate (conteneurs sans serveur à administrer), avec configuration réseau (subnets, security groups) ;</w:t>
             </w:r>
           </w:p>
           <w:p>
@@ -1757,7 +1882,7 @@
               <w:pStyle w:val="ListParagraph"/>
               <w:numPr>
                 <w:ilvl w:val="0"/>
-                <w:numId w:val="2"/>
+                <w:numId w:val="3"/>
               </w:numPr>
               <w:spacing w:after="40" w:before="0"/>
             </w:pPr>
@@ -1767,7 +1892,7 @@
                 <w:sz w:val="20"/>
                 <w:szCs w:val="20"/>
               </w:rPr>
-              <w:t xml:space="preserve">Execution des migrations de base de donnees via une tache ECS ephemere (run-task) avant chaque mise en service ;</w:t>
+              <w:t xml:space="preserve">Exécution des migrations de base de données via une tâche ECS éphémère (run-task) avant chaque mise en service ;</w:t>
             </w:r>
           </w:p>
           <w:p>
@@ -1775,7 +1900,7 @@
               <w:pStyle w:val="ListParagraph"/>
               <w:numPr>
                 <w:ilvl w:val="0"/>
-                <w:numId w:val="2"/>
+                <w:numId w:val="3"/>
               </w:numPr>
               <w:spacing w:after="40" w:before="0"/>
             </w:pPr>
@@ -1785,7 +1910,7 @@
                 <w:sz w:val="20"/>
                 <w:szCs w:val="20"/>
               </w:rPr>
-              <w:t xml:space="preserve">Mise a jour des services par force-new-deployment et attente de stabilisation automatique.</w:t>
+              <w:t xml:space="preserve">Mise à jour des services par force-new-deployment et attente de stabilisation automatique.</w:t>
             </w:r>
           </w:p>
           <w:p>
@@ -1882,7 +2007,7 @@
                 <w:sz w:val="20"/>
                 <w:szCs w:val="20"/>
               </w:rPr>
-              <w:t xml:space="preserve">2. Precisez les moyens utilises :</w:t>
+              <w:t xml:space="preserve">2. Précisez les moyens utilisés :</w:t>
             </w:r>
           </w:p>
         </w:tc>
@@ -1926,7 +2051,7 @@
               <w:pStyle w:val="ListParagraph"/>
               <w:numPr>
                 <w:ilvl w:val="0"/>
-                <w:numId w:val="2"/>
+                <w:numId w:val="3"/>
               </w:numPr>
               <w:spacing w:after="40" w:before="0"/>
             </w:pPr>
@@ -1936,7 +2061,7 @@
                 <w:sz w:val="20"/>
                 <w:szCs w:val="20"/>
               </w:rPr>
-              <w:t xml:space="preserve">Docker (multi-stage build), Docker Compose (override production)</w:t>
+              <w:t xml:space="preserve">Docker (build multi-étapes), Docker Compose (surcharge production)</w:t>
             </w:r>
           </w:p>
           <w:p>
@@ -1944,7 +2069,7 @@
               <w:pStyle w:val="ListParagraph"/>
               <w:numPr>
                 <w:ilvl w:val="0"/>
-                <w:numId w:val="2"/>
+                <w:numId w:val="3"/>
               </w:numPr>
               <w:spacing w:after="40" w:before="0"/>
             </w:pPr>
@@ -1962,7 +2087,7 @@
               <w:pStyle w:val="ListParagraph"/>
               <w:numPr>
                 <w:ilvl w:val="0"/>
-                <w:numId w:val="2"/>
+                <w:numId w:val="3"/>
               </w:numPr>
               <w:spacing w:after="40" w:before="0"/>
             </w:pPr>
@@ -1980,7 +2105,7 @@
               <w:pStyle w:val="ListParagraph"/>
               <w:numPr>
                 <w:ilvl w:val="0"/>
-                <w:numId w:val="2"/>
+                <w:numId w:val="3"/>
               </w:numPr>
               <w:spacing w:after="40" w:before="0"/>
             </w:pPr>
@@ -1998,7 +2123,7 @@
               <w:pStyle w:val="ListParagraph"/>
               <w:numPr>
                 <w:ilvl w:val="0"/>
-                <w:numId w:val="2"/>
+                <w:numId w:val="3"/>
               </w:numPr>
               <w:spacing w:after="40" w:before="0"/>
             </w:pPr>
@@ -2087,7 +2212,7 @@
                 <w:sz w:val="20"/>
                 <w:szCs w:val="20"/>
               </w:rPr>
-              <w:t xml:space="preserve">3. Avec qui avez-vous travaille ?</w:t>
+              <w:t xml:space="preserve">3. Avec qui avez-vous travaillé ?</w:t>
             </w:r>
           </w:p>
         </w:tc>
@@ -2142,7 +2267,7 @@
                 <w:sz w:val="20"/>
                 <w:szCs w:val="20"/>
               </w:rPr>
-              <w:t xml:space="preserve">Projet personnel realise en autonomie, de la conception a la mise en production cloud.</w:t>
+              <w:t xml:space="preserve">Projet personnel réalisé en autonomie, de la conception à la mise en production sur le cloud.</w:t>
             </w:r>
           </w:p>
           <w:p>
@@ -2287,7 +2412,7 @@
                 <w:sz w:val="20"/>
                 <w:szCs w:val="20"/>
               </w:rPr>
-              <w:t xml:space="preserve">Cadre (entreprise, organisme, association ou projet) : </w:t>
+              <w:t xml:space="preserve">Nom de l'entreprise, organisme ou association : </w:t>
             </w:r>
             <w:r>
               <w:rPr>
@@ -2307,15 +2432,15 @@
                 <w:sz w:val="20"/>
                 <w:szCs w:val="20"/>
               </w:rPr>
-              <w:t xml:space="preserve">Contexte / projet : </w:t>
-            </w:r>
-            <w:r>
-              <w:rPr>
-                <w:rFonts w:ascii="Arial" w:cs="Arial" w:eastAsia="Arial" w:hAnsi="Arial"/>
-                <w:sz w:val="20"/>
-                <w:szCs w:val="20"/>
-              </w:rPr>
-              <w:t xml:space="preserve">dropshop — application e-commerce conteneurisee deployee sur AWS</w:t>
+              <w:t xml:space="preserve">Chantier, atelier, service : </w:t>
+            </w:r>
+            <w:r>
+              <w:rPr>
+                <w:rFonts w:ascii="Arial" w:cs="Arial" w:eastAsia="Arial" w:hAnsi="Arial"/>
+                <w:sz w:val="20"/>
+                <w:szCs w:val="20"/>
+              </w:rPr>
+              <w:t xml:space="preserve">dropshop — application e-commerce conteneurisée déployée sur AWS</w:t>
             </w:r>
           </w:p>
           <w:p>
@@ -2327,7 +2452,7 @@
                 <w:sz w:val="20"/>
                 <w:szCs w:val="20"/>
               </w:rPr>
-              <w:t xml:space="preserve">Periode : Du </w:t>
+              <w:t xml:space="preserve">Période d'exercice : Du </w:t>
             </w:r>
             <w:r>
               <w:rPr>
@@ -2423,7 +2548,7 @@
                 <w:sz w:val="20"/>
                 <w:szCs w:val="20"/>
               </w:rPr>
-              <w:t xml:space="preserve">5. Informations complementaires (facultatif)</w:t>
+              <w:t xml:space="preserve">5. Informations complémentaires (facultatif)</w:t>
             </w:r>
           </w:p>
         </w:tc>
@@ -2559,7 +2684,7 @@
                 <w:sz w:val="22"/>
                 <w:szCs w:val="22"/>
               </w:rPr>
-              <w:t xml:space="preserve">Activite-type : Automatiser le deploiement d'une infrastructure dans le cloud</w:t>
+              <w:t xml:space="preserve">Activité-type : Automatiser le déploiement d'une infrastructure dans le cloud</w:t>
             </w:r>
           </w:p>
         </w:tc>
@@ -2603,7 +2728,7 @@
                 <w:sz w:val="20"/>
                 <w:szCs w:val="20"/>
               </w:rPr>
-              <w:t xml:space="preserve">iac-infra — Provisioning automatise d'une infrastructure (projet de formation)</w:t>
+              <w:t xml:space="preserve">iac-infra — Provisioning automatisé d'une infrastructure (projet de formation)</w:t>
             </w:r>
           </w:p>
         </w:tc>
@@ -2673,7 +2798,7 @@
                 <w:sz w:val="20"/>
                 <w:szCs w:val="20"/>
               </w:rPr>
-              <w:t xml:space="preserve">1. Decrivez les taches ou operations que vous avez effectuees, et dans quelles conditions :</w:t>
+              <w:t xml:space="preserve">1. Décrivez les tâches ou opérations que vous avez effectuées, et dans quelles conditions :</w:t>
             </w:r>
           </w:p>
         </w:tc>
@@ -2728,7 +2853,7 @@
                 <w:sz w:val="20"/>
                 <w:szCs w:val="20"/>
               </w:rPr>
-              <w:t xml:space="preserve">Dans le cadre de ma formation ASD, j'ai automatise le deploiement complet d'une infrastructure hebergeant une application WordPress :</w:t>
+              <w:t xml:space="preserve">Dans le cadre de ma formation ASD, j'ai automatisé le déploiement complet d'une infrastructure hébergeant une application WordPress :</w:t>
             </w:r>
           </w:p>
           <w:p>
@@ -2736,7 +2861,7 @@
               <w:pStyle w:val="ListParagraph"/>
               <w:numPr>
                 <w:ilvl w:val="0"/>
-                <w:numId w:val="2"/>
+                <w:numId w:val="3"/>
               </w:numPr>
               <w:spacing w:after="40" w:before="0"/>
             </w:pPr>
@@ -2746,7 +2871,7 @@
                 <w:sz w:val="20"/>
                 <w:szCs w:val="20"/>
               </w:rPr>
-              <w:t xml:space="preserve">Provisioning d'une VM Ubuntu 22.04 avec Vagrant (Vagrantfile versionne, reseau host-only) ;</w:t>
+              <w:t xml:space="preserve">Provisioning d'une VM Ubuntu 22.04 avec Vagrant (Vagrantfile versionné, réseau host-only) ;</w:t>
             </w:r>
           </w:p>
           <w:p>
@@ -2754,7 +2879,7 @@
               <w:pStyle w:val="ListParagraph"/>
               <w:numPr>
                 <w:ilvl w:val="0"/>
-                <w:numId w:val="2"/>
+                <w:numId w:val="3"/>
               </w:numPr>
               <w:spacing w:after="40" w:before="0"/>
             </w:pPr>
@@ -2764,7 +2889,7 @@
                 <w:sz w:val="20"/>
                 <w:szCs w:val="20"/>
               </w:rPr>
-              <w:t xml:space="preserve">Configuration automatisee par Ansible en 4 roles (base, securite, monitoring, webapp) ;</w:t>
+              <w:t xml:space="preserve">Configuration automatisée par Ansible en 4 rôles (base, sécurité, monitoring, webapp) ;</w:t>
             </w:r>
           </w:p>
           <w:p>
@@ -2772,7 +2897,7 @@
               <w:pStyle w:val="ListParagraph"/>
               <w:numPr>
                 <w:ilvl w:val="0"/>
-                <w:numId w:val="2"/>
+                <w:numId w:val="3"/>
               </w:numPr>
               <w:spacing w:after="40" w:before="0"/>
             </w:pPr>
@@ -2782,7 +2907,7 @@
                 <w:sz w:val="20"/>
                 <w:szCs w:val="20"/>
               </w:rPr>
-              <w:t xml:space="preserve">Generation de l'inventaire et des informations d'infrastructure avec Terraform ;</w:t>
+              <w:t xml:space="preserve">Génération de l'inventaire et des informations d'infrastructure avec Terraform ;</w:t>
             </w:r>
           </w:p>
           <w:p>
@@ -2790,7 +2915,7 @@
               <w:pStyle w:val="ListParagraph"/>
               <w:numPr>
                 <w:ilvl w:val="0"/>
-                <w:numId w:val="2"/>
+                <w:numId w:val="3"/>
               </w:numPr>
               <w:spacing w:after="40" w:before="0"/>
             </w:pPr>
@@ -2800,7 +2925,7 @@
                 <w:sz w:val="20"/>
                 <w:szCs w:val="20"/>
               </w:rPr>
-              <w:t xml:space="preserve">Orchestration en Kubernetes : WordPress (2 replicas) + MariaDB + PVC + Secret + autoscaling HPA ;</w:t>
+              <w:t xml:space="preserve">Orchestration en Kubernetes : WordPress (2 réplicas) + MariaDB + PVC + Secret + autoscaling HPA ;</w:t>
             </w:r>
           </w:p>
           <w:p>
@@ -2808,7 +2933,7 @@
               <w:pStyle w:val="ListParagraph"/>
               <w:numPr>
                 <w:ilvl w:val="0"/>
-                <w:numId w:val="2"/>
+                <w:numId w:val="3"/>
               </w:numPr>
               <w:spacing w:after="40" w:before="0"/>
             </w:pPr>
@@ -2818,7 +2943,7 @@
                 <w:sz w:val="20"/>
                 <w:szCs w:val="20"/>
               </w:rPr>
-              <w:t xml:space="preserve">Toutes les operations sont idempotentes et reproductibles depuis zero.</w:t>
+              <w:t xml:space="preserve">Toutes les opérations sont idempotentes et reproductibles depuis zéro.</w:t>
             </w:r>
           </w:p>
           <w:p>
@@ -2924,7 +3049,7 @@
                 <w:sz w:val="20"/>
                 <w:szCs w:val="20"/>
               </w:rPr>
-              <w:t xml:space="preserve">2. Precisez les moyens utilises :</w:t>
+              <w:t xml:space="preserve">2. Précisez les moyens utilisés :</w:t>
             </w:r>
           </w:p>
         </w:tc>
@@ -2968,7 +3093,7 @@
               <w:pStyle w:val="ListParagraph"/>
               <w:numPr>
                 <w:ilvl w:val="0"/>
-                <w:numId w:val="2"/>
+                <w:numId w:val="3"/>
               </w:numPr>
               <w:spacing w:after="40" w:before="0"/>
             </w:pPr>
@@ -2978,7 +3103,7 @@
                 <w:sz w:val="20"/>
                 <w:szCs w:val="20"/>
               </w:rPr>
-              <w:t xml:space="preserve">Vagrant + VirtualBox, Ansible (roles, handlers, templates Jinja2)</w:t>
+              <w:t xml:space="preserve">Vagrant + VirtualBox, Ansible (rôles, handlers, templates Jinja2)</w:t>
             </w:r>
           </w:p>
           <w:p>
@@ -2986,7 +3111,7 @@
               <w:pStyle w:val="ListParagraph"/>
               <w:numPr>
                 <w:ilvl w:val="0"/>
-                <w:numId w:val="2"/>
+                <w:numId w:val="3"/>
               </w:numPr>
               <w:spacing w:after="40" w:before="0"/>
             </w:pPr>
@@ -3004,7 +3129,7 @@
               <w:pStyle w:val="ListParagraph"/>
               <w:numPr>
                 <w:ilvl w:val="0"/>
-                <w:numId w:val="2"/>
+                <w:numId w:val="3"/>
               </w:numPr>
               <w:spacing w:after="40" w:before="0"/>
             </w:pPr>
@@ -3022,7 +3147,7 @@
               <w:pStyle w:val="ListParagraph"/>
               <w:numPr>
                 <w:ilvl w:val="0"/>
-                <w:numId w:val="2"/>
+                <w:numId w:val="3"/>
               </w:numPr>
               <w:spacing w:after="40" w:before="0"/>
             </w:pPr>
@@ -3032,7 +3157,7 @@
                 <w:sz w:val="20"/>
                 <w:szCs w:val="20"/>
               </w:rPr>
-              <w:t xml:space="preserve">WordPress (image custom durcie), MariaDB</w:t>
+              <w:t xml:space="preserve">WordPress (image personnalisée durcie), MariaDB</w:t>
             </w:r>
           </w:p>
           <w:p>
@@ -3120,7 +3245,7 @@
                 <w:sz w:val="20"/>
                 <w:szCs w:val="20"/>
               </w:rPr>
-              <w:t xml:space="preserve">3. Avec qui avez-vous travaille ?</w:t>
+              <w:t xml:space="preserve">3. Avec qui avez-vous travaillé ?</w:t>
             </w:r>
           </w:p>
         </w:tc>
@@ -3175,7 +3300,7 @@
                 <w:sz w:val="20"/>
                 <w:szCs w:val="20"/>
               </w:rPr>
-              <w:t xml:space="preserve">Projet de formation realise en autonomie, sous la supervision pedagogique de Max Fauquemberg.</w:t>
+              <w:t xml:space="preserve">Projet de formation réalisé en autonomie, sous la supervision pédagogique de Max Fauquemberg.</w:t>
             </w:r>
           </w:p>
           <w:p>
@@ -3320,15 +3445,15 @@
                 <w:sz w:val="20"/>
                 <w:szCs w:val="20"/>
               </w:rPr>
-              <w:t xml:space="preserve">Cadre (entreprise, organisme, association ou projet) : </w:t>
-            </w:r>
-            <w:r>
-              <w:rPr>
-                <w:rFonts w:ascii="Arial" w:cs="Arial" w:eastAsia="Arial" w:hAnsi="Arial"/>
-                <w:sz w:val="20"/>
-                <w:szCs w:val="20"/>
-              </w:rPr>
-              <w:t xml:space="preserve">Ecole IT d'Orleans</w:t>
+              <w:t xml:space="preserve">Nom de l'entreprise, organisme ou association : </w:t>
+            </w:r>
+            <w:r>
+              <w:rPr>
+                <w:rFonts w:ascii="Arial" w:cs="Arial" w:eastAsia="Arial" w:hAnsi="Arial"/>
+                <w:sz w:val="20"/>
+                <w:szCs w:val="20"/>
+              </w:rPr>
+              <w:t xml:space="preserve">École IT d'Orléans</w:t>
             </w:r>
           </w:p>
           <w:p>
@@ -3340,15 +3465,15 @@
                 <w:sz w:val="20"/>
                 <w:szCs w:val="20"/>
               </w:rPr>
-              <w:t xml:space="preserve">Contexte / projet : </w:t>
-            </w:r>
-            <w:r>
-              <w:rPr>
-                <w:rFonts w:ascii="Arial" w:cs="Arial" w:eastAsia="Arial" w:hAnsi="Arial"/>
-                <w:sz w:val="20"/>
-                <w:szCs w:val="20"/>
-              </w:rPr>
-              <w:t xml:space="preserve">iac-infra — projet fil rouge ASD (deploiement WordPress automatise)</w:t>
+              <w:t xml:space="preserve">Chantier, atelier, service : </w:t>
+            </w:r>
+            <w:r>
+              <w:rPr>
+                <w:rFonts w:ascii="Arial" w:cs="Arial" w:eastAsia="Arial" w:hAnsi="Arial"/>
+                <w:sz w:val="20"/>
+                <w:szCs w:val="20"/>
+              </w:rPr>
+              <w:t xml:space="preserve">iac-infra — projet fil rouge ASD (déploiement WordPress automatisé)</w:t>
             </w:r>
           </w:p>
           <w:p>
@@ -3360,7 +3485,7 @@
                 <w:sz w:val="20"/>
                 <w:szCs w:val="20"/>
               </w:rPr>
-              <w:t xml:space="preserve">Periode : Du </w:t>
+              <w:t xml:space="preserve">Période d'exercice : Du </w:t>
             </w:r>
             <w:r>
               <w:rPr>
@@ -3456,7 +3581,7 @@
                 <w:sz w:val="20"/>
                 <w:szCs w:val="20"/>
               </w:rPr>
-              <w:t xml:space="preserve">5. Informations complementaires (facultatif)</w:t>
+              <w:t xml:space="preserve">5. Informations complémentaires (facultatif)</w:t>
             </w:r>
           </w:p>
         </w:tc>
@@ -3592,7 +3717,7 @@
                 <w:sz w:val="22"/>
                 <w:szCs w:val="22"/>
               </w:rPr>
-              <w:t xml:space="preserve">Activite-type : Deployer une application en continu</w:t>
+              <w:t xml:space="preserve">Activité-type : Déployer une application en continu</w:t>
             </w:r>
           </w:p>
         </w:tc>
@@ -3706,7 +3831,7 @@
                 <w:sz w:val="20"/>
                 <w:szCs w:val="20"/>
               </w:rPr>
-              <w:t xml:space="preserve">1. Decrivez les taches ou operations que vous avez effectuees, et dans quelles conditions :</w:t>
+              <w:t xml:space="preserve">1. Décrivez les tâches ou opérations que vous avez effectuées, et dans quelles conditions :</w:t>
             </w:r>
           </w:p>
         </w:tc>
@@ -3761,7 +3886,7 @@
                 <w:sz w:val="20"/>
                 <w:szCs w:val="20"/>
               </w:rPr>
-              <w:t xml:space="preserve">J'ai mis en place un pipeline de deploiement continu declenche a chaque push sur la branche main, en 3 jobs sequentiels :</w:t>
+              <w:t xml:space="preserve">J'ai mis en place un pipeline de déploiement continu déclenché à chaque push sur la branche main, en trois jobs séquentiels :</w:t>
             </w:r>
           </w:p>
           <w:p>
@@ -3788,7 +3913,7 @@
               <w:pStyle w:val="ListParagraph"/>
               <w:numPr>
                 <w:ilvl w:val="0"/>
-                <w:numId w:val="2"/>
+                <w:numId w:val="3"/>
               </w:numPr>
               <w:spacing w:after="40" w:before="0"/>
             </w:pPr>
@@ -3817,7 +3942,7 @@
                 <w:sz w:val="20"/>
                 <w:szCs w:val="20"/>
               </w:rPr>
-              <w:t xml:space="preserve">Job 2 — Build &amp; Push :</w:t>
+              <w:t xml:space="preserve">Job 2 — Build et Push :</w:t>
             </w:r>
           </w:p>
           <w:p>
@@ -3825,7 +3950,7 @@
               <w:pStyle w:val="ListParagraph"/>
               <w:numPr>
                 <w:ilvl w:val="0"/>
-                <w:numId w:val="2"/>
+                <w:numId w:val="3"/>
               </w:numPr>
               <w:spacing w:after="40" w:before="0"/>
             </w:pPr>
@@ -3835,7 +3960,7 @@
                 <w:sz w:val="20"/>
                 <w:szCs w:val="20"/>
               </w:rPr>
-              <w:t xml:space="preserve">Build des images Docker (web, celery, nginx) avec Docker Buildx et cache GitHub Actions ;</w:t>
+              <w:t xml:space="preserve">Construction des images Docker (web, celery, nginx) avec Docker Buildx et cache GitHub Actions ;</w:t>
             </w:r>
           </w:p>
           <w:p>
@@ -3843,7 +3968,7 @@
               <w:pStyle w:val="ListParagraph"/>
               <w:numPr>
                 <w:ilvl w:val="0"/>
-                <w:numId w:val="2"/>
+                <w:numId w:val="3"/>
               </w:numPr>
               <w:spacing w:after="40" w:before="0"/>
             </w:pPr>
@@ -3853,7 +3978,7 @@
                 <w:sz w:val="20"/>
                 <w:szCs w:val="20"/>
               </w:rPr>
-              <w:t xml:space="preserve">Tag des images par le SHA court du commit + tag latest, push sur Amazon ECR ;</w:t>
+              <w:t xml:space="preserve">Étiquetage des images par le SHA court du commit puis push sur Amazon ECR ;</w:t>
             </w:r>
           </w:p>
           <w:p>
@@ -3880,7 +4005,7 @@
               <w:pStyle w:val="ListParagraph"/>
               <w:numPr>
                 <w:ilvl w:val="0"/>
-                <w:numId w:val="2"/>
+                <w:numId w:val="3"/>
               </w:numPr>
               <w:spacing w:after="40" w:before="0"/>
             </w:pPr>
@@ -3890,7 +4015,7 @@
                 <w:sz w:val="20"/>
                 <w:szCs w:val="20"/>
               </w:rPr>
-              <w:t xml:space="preserve">Migration de la base via une tache ECS ephemere (avec controle du code de sortie) ;</w:t>
+              <w:t xml:space="preserve">Migration de la base via une tâche ECS éphémère (avec contrôle du code de sortie) ;</w:t>
             </w:r>
           </w:p>
           <w:p>
@@ -3898,7 +4023,7 @@
               <w:pStyle w:val="ListParagraph"/>
               <w:numPr>
                 <w:ilvl w:val="0"/>
-                <w:numId w:val="2"/>
+                <w:numId w:val="3"/>
               </w:numPr>
               <w:spacing w:after="40" w:before="0"/>
             </w:pPr>
@@ -3908,7 +4033,7 @@
                 <w:sz w:val="20"/>
                 <w:szCs w:val="20"/>
               </w:rPr>
-              <w:t xml:space="preserve">Deploiement des services web et celery (force-new-deployment) + attente de stabilisation ;</w:t>
+              <w:t xml:space="preserve">Déploiement des services web et celery (force-new-deployment) puis attente de stabilisation ;</w:t>
             </w:r>
           </w:p>
           <w:p>
@@ -3916,7 +4041,7 @@
               <w:pStyle w:val="ListParagraph"/>
               <w:numPr>
                 <w:ilvl w:val="0"/>
-                <w:numId w:val="2"/>
+                <w:numId w:val="3"/>
               </w:numPr>
               <w:spacing w:after="40" w:before="0"/>
             </w:pPr>
@@ -3926,7 +4051,7 @@
                 <w:sz w:val="20"/>
                 <w:szCs w:val="20"/>
               </w:rPr>
-              <w:t xml:space="preserve">Environnement 'production' protege (gate de validation possible).</w:t>
+              <w:t xml:space="preserve">Environnement « production » protégé (validation possible par un relecteur).</w:t>
             </w:r>
           </w:p>
         </w:tc>
@@ -3996,7 +4121,7 @@
                 <w:sz w:val="20"/>
                 <w:szCs w:val="20"/>
               </w:rPr>
-              <w:t xml:space="preserve">2. Precisez les moyens utilises :</w:t>
+              <w:t xml:space="preserve">2. Précisez les moyens utilisés :</w:t>
             </w:r>
           </w:p>
         </w:tc>
@@ -4040,7 +4165,7 @@
               <w:pStyle w:val="ListParagraph"/>
               <w:numPr>
                 <w:ilvl w:val="0"/>
-                <w:numId w:val="2"/>
+                <w:numId w:val="3"/>
               </w:numPr>
               <w:spacing w:after="40" w:before="0"/>
             </w:pPr>
@@ -4050,7 +4175,7 @@
                 <w:sz w:val="20"/>
                 <w:szCs w:val="20"/>
               </w:rPr>
-              <w:t xml:space="preserve">GitHub Actions (workflow multi-jobs, secrets, environnements proteges)</w:t>
+              <w:t xml:space="preserve">GitHub Actions (workflow multi-jobs, secrets, environnements protégés)</w:t>
             </w:r>
           </w:p>
           <w:p>
@@ -4058,7 +4183,7 @@
               <w:pStyle w:val="ListParagraph"/>
               <w:numPr>
                 <w:ilvl w:val="0"/>
-                <w:numId w:val="2"/>
+                <w:numId w:val="3"/>
               </w:numPr>
               <w:spacing w:after="40" w:before="0"/>
             </w:pPr>
@@ -4068,7 +4193,7 @@
                 <w:sz w:val="20"/>
                 <w:szCs w:val="20"/>
               </w:rPr>
-              <w:t xml:space="preserve">ruff (lint Python), Docker Buildx (+ cache GHA)</w:t>
+              <w:t xml:space="preserve">ruff (analyse statique Python), Docker Buildx (avec cache)</w:t>
             </w:r>
           </w:p>
           <w:p>
@@ -4076,7 +4201,7 @@
               <w:pStyle w:val="ListParagraph"/>
               <w:numPr>
                 <w:ilvl w:val="0"/>
-                <w:numId w:val="2"/>
+                <w:numId w:val="3"/>
               </w:numPr>
               <w:spacing w:after="40" w:before="0"/>
             </w:pPr>
@@ -4094,7 +4219,7 @@
               <w:pStyle w:val="ListParagraph"/>
               <w:numPr>
                 <w:ilvl w:val="0"/>
-                <w:numId w:val="2"/>
+                <w:numId w:val="3"/>
               </w:numPr>
               <w:spacing w:after="40" w:before="0"/>
             </w:pPr>
@@ -4104,7 +4229,7 @@
                 <w:sz w:val="20"/>
                 <w:szCs w:val="20"/>
               </w:rPr>
-              <w:t xml:space="preserve">Strategie de tag par SHA de commit (tracabilite)</w:t>
+              <w:t xml:space="preserve">Stratégie d'étiquetage par SHA de commit (traçabilité)</w:t>
             </w:r>
           </w:p>
           <w:p>
@@ -4192,7 +4317,7 @@
                 <w:sz w:val="20"/>
                 <w:szCs w:val="20"/>
               </w:rPr>
-              <w:t xml:space="preserve">3. Avec qui avez-vous travaille ?</w:t>
+              <w:t xml:space="preserve">3. Avec qui avez-vous travaillé ?</w:t>
             </w:r>
           </w:p>
         </w:tc>
@@ -4247,7 +4372,7 @@
                 <w:sz w:val="20"/>
                 <w:szCs w:val="20"/>
               </w:rPr>
-              <w:t xml:space="preserve">Projet personnel realise en autonomie.</w:t>
+              <w:t xml:space="preserve">Projet personnel réalisé en autonomie.</w:t>
             </w:r>
           </w:p>
           <w:p>
@@ -4392,7 +4517,7 @@
                 <w:sz w:val="20"/>
                 <w:szCs w:val="20"/>
               </w:rPr>
-              <w:t xml:space="preserve">Cadre (entreprise, organisme, association ou projet) : </w:t>
+              <w:t xml:space="preserve">Nom de l'entreprise, organisme ou association : </w:t>
             </w:r>
             <w:r>
               <w:rPr>
@@ -4412,15 +4537,15 @@
                 <w:sz w:val="20"/>
                 <w:szCs w:val="20"/>
               </w:rPr>
-              <w:t xml:space="preserve">Contexte / projet : </w:t>
-            </w:r>
-            <w:r>
-              <w:rPr>
-                <w:rFonts w:ascii="Arial" w:cs="Arial" w:eastAsia="Arial" w:hAnsi="Arial"/>
-                <w:sz w:val="20"/>
-                <w:szCs w:val="20"/>
-              </w:rPr>
-              <w:t xml:space="preserve">dropshop — chaine de deploiement continu vers AWS</w:t>
+              <w:t xml:space="preserve">Chantier, atelier, service : </w:t>
+            </w:r>
+            <w:r>
+              <w:rPr>
+                <w:rFonts w:ascii="Arial" w:cs="Arial" w:eastAsia="Arial" w:hAnsi="Arial"/>
+                <w:sz w:val="20"/>
+                <w:szCs w:val="20"/>
+              </w:rPr>
+              <w:t xml:space="preserve">dropshop — chaîne de déploiement continu vers AWS</w:t>
             </w:r>
           </w:p>
           <w:p>
@@ -4432,7 +4557,7 @@
                 <w:sz w:val="20"/>
                 <w:szCs w:val="20"/>
               </w:rPr>
-              <w:t xml:space="preserve">Periode : Du </w:t>
+              <w:t xml:space="preserve">Période d'exercice : Du </w:t>
             </w:r>
             <w:r>
               <w:rPr>
@@ -4528,7 +4653,7 @@
                 <w:sz w:val="20"/>
                 <w:szCs w:val="20"/>
               </w:rPr>
-              <w:t xml:space="preserve">5. Informations complementaires (facultatif)</w:t>
+              <w:t xml:space="preserve">5. Informations complémentaires (facultatif)</w:t>
             </w:r>
           </w:p>
         </w:tc>
@@ -4664,7 +4789,7 @@
                 <w:sz w:val="22"/>
                 <w:szCs w:val="22"/>
               </w:rPr>
-              <w:t xml:space="preserve">Activite-type : Deployer une application en continu</w:t>
+              <w:t xml:space="preserve">Activité-type : Déployer une application en continu</w:t>
             </w:r>
           </w:p>
         </w:tc>
@@ -4708,7 +4833,7 @@
                 <w:sz w:val="20"/>
                 <w:szCs w:val="20"/>
               </w:rPr>
-              <w:t xml:space="preserve">chatbot-rag — Integration continue GitLab (projet personnel)</w:t>
+              <w:t xml:space="preserve">chatbot-rag — Intégration continue GitLab (projet personnel)</w:t>
             </w:r>
           </w:p>
         </w:tc>
@@ -4778,7 +4903,7 @@
                 <w:sz w:val="20"/>
                 <w:szCs w:val="20"/>
               </w:rPr>
-              <w:t xml:space="preserve">1. Decrivez les taches ou operations que vous avez effectuees, et dans quelles conditions :</w:t>
+              <w:t xml:space="preserve">1. Décrivez les tâches ou opérations que vous avez effectuées, et dans quelles conditions :</w:t>
             </w:r>
           </w:p>
         </w:tc>
@@ -4833,7 +4958,7 @@
                 <w:sz w:val="20"/>
                 <w:szCs w:val="20"/>
               </w:rPr>
-              <w:t xml:space="preserve">chatbot-rag est un assistant de questions/reponses sur documents (architecture RAG) que j'ai developpe avec FastAPI. J'ai mis en place une chaine d'integration continue GitLab :</w:t>
+              <w:t xml:space="preserve">chatbot-rag est un assistant de questions / réponses sur documents (architecture RAG) que j'ai développé avec FastAPI. J'ai mis en place une chaîne d'intégration continue GitLab :</w:t>
             </w:r>
           </w:p>
           <w:p>
@@ -4841,7 +4966,7 @@
               <w:pStyle w:val="ListParagraph"/>
               <w:numPr>
                 <w:ilvl w:val="0"/>
-                <w:numId w:val="2"/>
+                <w:numId w:val="3"/>
               </w:numPr>
               <w:spacing w:after="40" w:before="0"/>
             </w:pPr>
@@ -4851,7 +4976,7 @@
                 <w:sz w:val="20"/>
                 <w:szCs w:val="20"/>
               </w:rPr>
-              <w:t xml:space="preserve">Stage test : installation des dependances et execution des tests automatises avec pytest ;</w:t>
+              <w:t xml:space="preserve">Étape « test » : installation des dépendances et exécution des tests automatisés avec pytest ;</w:t>
             </w:r>
           </w:p>
           <w:p>
@@ -4859,7 +4984,7 @@
               <w:pStyle w:val="ListParagraph"/>
               <w:numPr>
                 <w:ilvl w:val="0"/>
-                <w:numId w:val="2"/>
+                <w:numId w:val="3"/>
               </w:numPr>
               <w:spacing w:after="40" w:before="0"/>
             </w:pPr>
@@ -4869,7 +4994,7 @@
                 <w:sz w:val="20"/>
                 <w:szCs w:val="20"/>
               </w:rPr>
-              <w:t xml:space="preserve">Stage build : construction de l'image Docker (declenchee uniquement sur main) ;</w:t>
+              <w:t xml:space="preserve">Étape « build » : construction de l'image Docker (déclenchée uniquement sur la branche main) ;</w:t>
             </w:r>
           </w:p>
           <w:p>
@@ -4877,7 +5002,7 @@
               <w:pStyle w:val="ListParagraph"/>
               <w:numPr>
                 <w:ilvl w:val="0"/>
-                <w:numId w:val="2"/>
+                <w:numId w:val="3"/>
               </w:numPr>
               <w:spacing w:after="40" w:before="0"/>
             </w:pPr>
@@ -4887,7 +5012,7 @@
                 <w:sz w:val="20"/>
                 <w:szCs w:val="20"/>
               </w:rPr>
-              <w:t xml:space="preserve">Mise en cache des dependances pip pour accelerer les pipelines ;</w:t>
+              <w:t xml:space="preserve">Mise en cache des dépendances pip pour accélérer les pipelines ;</w:t>
             </w:r>
           </w:p>
           <w:p>
@@ -4895,7 +5020,7 @@
               <w:pStyle w:val="ListParagraph"/>
               <w:numPr>
                 <w:ilvl w:val="0"/>
-                <w:numId w:val="2"/>
+                <w:numId w:val="3"/>
               </w:numPr>
               <w:spacing w:after="40" w:before="0"/>
             </w:pPr>
@@ -4905,7 +5030,7 @@
                 <w:sz w:val="20"/>
                 <w:szCs w:val="20"/>
               </w:rPr>
-              <w:t xml:space="preserve">Conteneurisation de l'API (image python-slim, lancement via uvicorn) avec endpoints de health check.</w:t>
+              <w:t xml:space="preserve">Conteneurisation de l'API (image python-slim, lancement via uvicorn) avec des points de contrôle de santé (health checks).</w:t>
             </w:r>
           </w:p>
           <w:p>
@@ -5020,7 +5145,7 @@
                 <w:sz w:val="20"/>
                 <w:szCs w:val="20"/>
               </w:rPr>
-              <w:t xml:space="preserve">2. Precisez les moyens utilises :</w:t>
+              <w:t xml:space="preserve">2. Précisez les moyens utilisés :</w:t>
             </w:r>
           </w:p>
         </w:tc>
@@ -5064,7 +5189,7 @@
               <w:pStyle w:val="ListParagraph"/>
               <w:numPr>
                 <w:ilvl w:val="0"/>
-                <w:numId w:val="2"/>
+                <w:numId w:val="3"/>
               </w:numPr>
               <w:spacing w:after="40" w:before="0"/>
             </w:pPr>
@@ -5074,7 +5199,7 @@
                 <w:sz w:val="20"/>
                 <w:szCs w:val="20"/>
               </w:rPr>
-              <w:t xml:space="preserve">GitLab CI (.gitlab-ci.yml, stages test/build, cache)</w:t>
+              <w:t xml:space="preserve">GitLab CI (.gitlab-ci.yml, étapes test / build, cache)</w:t>
             </w:r>
           </w:p>
           <w:p>
@@ -5082,7 +5207,7 @@
               <w:pStyle w:val="ListParagraph"/>
               <w:numPr>
                 <w:ilvl w:val="0"/>
-                <w:numId w:val="2"/>
+                <w:numId w:val="3"/>
               </w:numPr>
               <w:spacing w:after="40" w:before="0"/>
             </w:pPr>
@@ -5100,7 +5225,7 @@
               <w:pStyle w:val="ListParagraph"/>
               <w:numPr>
                 <w:ilvl w:val="0"/>
-                <w:numId w:val="2"/>
+                <w:numId w:val="3"/>
               </w:numPr>
               <w:spacing w:after="40" w:before="0"/>
             </w:pPr>
@@ -5207,7 +5332,7 @@
                 <w:sz w:val="20"/>
                 <w:szCs w:val="20"/>
               </w:rPr>
-              <w:t xml:space="preserve">3. Avec qui avez-vous travaille ?</w:t>
+              <w:t xml:space="preserve">3. Avec qui avez-vous travaillé ?</w:t>
             </w:r>
           </w:p>
         </w:tc>
@@ -5262,7 +5387,7 @@
                 <w:sz w:val="20"/>
                 <w:szCs w:val="20"/>
               </w:rPr>
-              <w:t xml:space="preserve">Projet personnel realise en autonomie.</w:t>
+              <w:t xml:space="preserve">Projet personnel réalisé en autonomie.</w:t>
             </w:r>
           </w:p>
           <w:p>
@@ -5407,7 +5532,7 @@
                 <w:sz w:val="20"/>
                 <w:szCs w:val="20"/>
               </w:rPr>
-              <w:t xml:space="preserve">Cadre (entreprise, organisme, association ou projet) : </w:t>
+              <w:t xml:space="preserve">Nom de l'entreprise, organisme ou association : </w:t>
             </w:r>
             <w:r>
               <w:rPr>
@@ -5427,7 +5552,7 @@
                 <w:sz w:val="20"/>
                 <w:szCs w:val="20"/>
               </w:rPr>
-              <w:t xml:space="preserve">Contexte / projet : </w:t>
+              <w:t xml:space="preserve">Chantier, atelier, service : </w:t>
             </w:r>
             <w:r>
               <w:rPr>
@@ -5447,7 +5572,7 @@
                 <w:sz w:val="20"/>
                 <w:szCs w:val="20"/>
               </w:rPr>
-              <w:t xml:space="preserve">Periode : Du </w:t>
+              <w:t xml:space="preserve">Période d'exercice : Du </w:t>
             </w:r>
             <w:r>
               <w:rPr>
@@ -5543,7 +5668,7 @@
                 <w:sz w:val="20"/>
                 <w:szCs w:val="20"/>
               </w:rPr>
-              <w:t xml:space="preserve">5. Informations complementaires (facultatif)</w:t>
+              <w:t xml:space="preserve">5. Informations complémentaires (facultatif)</w:t>
             </w:r>
           </w:p>
         </w:tc>
@@ -5679,7 +5804,7 @@
                 <w:sz w:val="22"/>
                 <w:szCs w:val="22"/>
               </w:rPr>
-              <w:t xml:space="preserve">Activite-type : Deployer une application en continu</w:t>
+              <w:t xml:space="preserve">Activité-type : Déployer une application en continu</w:t>
             </w:r>
           </w:p>
         </w:tc>
@@ -5723,7 +5848,7 @@
                 <w:sz w:val="20"/>
                 <w:szCs w:val="20"/>
               </w:rPr>
-              <w:t xml:space="preserve">avance-web — Deploiement continu sur Vercel (projet associatif)</w:t>
+              <w:t xml:space="preserve">avance-web — Déploiement continu sur Vercel (projet associatif)</w:t>
             </w:r>
           </w:p>
         </w:tc>
@@ -5793,7 +5918,7 @@
                 <w:sz w:val="20"/>
                 <w:szCs w:val="20"/>
               </w:rPr>
-              <w:t xml:space="preserve">1. Decrivez les taches ou operations que vous avez effectuees, et dans quelles conditions :</w:t>
+              <w:t xml:space="preserve">1. Décrivez les tâches ou opérations que vous avez effectuées, et dans quelles conditions :</w:t>
             </w:r>
           </w:p>
         </w:tc>
@@ -5848,7 +5973,7 @@
                 <w:sz w:val="20"/>
                 <w:szCs w:val="20"/>
               </w:rPr>
-              <w:t xml:space="preserve">J'ai realise le site officiel du reseau AVanCe (reseau de prise en charge de l'AVC, rattache au Centre Hospitalier d'Auxerre), avec un deploiement continu :</w:t>
+              <w:t xml:space="preserve">J'ai réalisé le site officiel du réseau AVanCe (réseau de prise en charge de l'AVC, rattaché au Centre Hospitalier d'Auxerre), avec un déploiement continu :</w:t>
             </w:r>
           </w:p>
           <w:p>
@@ -5856,7 +5981,7 @@
               <w:pStyle w:val="ListParagraph"/>
               <w:numPr>
                 <w:ilvl w:val="0"/>
-                <w:numId w:val="2"/>
+                <w:numId w:val="3"/>
               </w:numPr>
               <w:spacing w:after="40" w:before="0"/>
             </w:pPr>
@@ -5866,7 +5991,7 @@
                 <w:sz w:val="20"/>
                 <w:szCs w:val="20"/>
               </w:rPr>
-              <w:t xml:space="preserve">Developpement d'une application web Next.js (TypeScript) ;</w:t>
+              <w:t xml:space="preserve">Développement d'une application web Next.js (TypeScript) ;</w:t>
             </w:r>
           </w:p>
           <w:p>
@@ -5874,7 +5999,7 @@
               <w:pStyle w:val="ListParagraph"/>
               <w:numPr>
                 <w:ilvl w:val="0"/>
-                <w:numId w:val="2"/>
+                <w:numId w:val="3"/>
               </w:numPr>
               <w:spacing w:after="40" w:before="0"/>
             </w:pPr>
@@ -5884,7 +6009,7 @@
                 <w:sz w:val="20"/>
                 <w:szCs w:val="20"/>
               </w:rPr>
-              <w:t xml:space="preserve">Mise en place du deploiement continu via Vercel : chaque push Git declenche automatiquement un build et une mise en ligne ;</w:t>
+              <w:t xml:space="preserve">Mise en place du déploiement continu via Vercel : chaque push Git déclenche automatiquement une construction et une mise en ligne ;</w:t>
             </w:r>
           </w:p>
           <w:p>
@@ -5892,7 +6017,7 @@
               <w:pStyle w:val="ListParagraph"/>
               <w:numPr>
                 <w:ilvl w:val="0"/>
-                <w:numId w:val="2"/>
+                <w:numId w:val="3"/>
               </w:numPr>
               <w:spacing w:after="40" w:before="0"/>
             </w:pPr>
@@ -5902,7 +6027,7 @@
                 <w:sz w:val="20"/>
                 <w:szCs w:val="20"/>
               </w:rPr>
-              <w:t xml:space="preserve">Previsualisations automatiques par branche (preview deployments) avant mise en production ;</w:t>
+              <w:t xml:space="preserve">Prévisualisations automatiques par branche (preview deployments) avant la mise en production ;</w:t>
             </w:r>
           </w:p>
           <w:p>
@@ -5910,7 +6035,7 @@
               <w:pStyle w:val="ListParagraph"/>
               <w:numPr>
                 <w:ilvl w:val="0"/>
-                <w:numId w:val="2"/>
+                <w:numId w:val="3"/>
               </w:numPr>
               <w:spacing w:after="40" w:before="0"/>
             </w:pPr>
@@ -5920,7 +6045,7 @@
                 <w:sz w:val="20"/>
                 <w:szCs w:val="20"/>
               </w:rPr>
-              <w:t xml:space="preserve">Optimisations integrees (polices, images) pour la performance.</w:t>
+              <w:t xml:space="preserve">Optimisations intégrées (polices, images) pour la performance du site.</w:t>
             </w:r>
           </w:p>
           <w:p>
@@ -6035,7 +6160,7 @@
                 <w:sz w:val="20"/>
                 <w:szCs w:val="20"/>
               </w:rPr>
-              <w:t xml:space="preserve">2. Precisez les moyens utilises :</w:t>
+              <w:t xml:space="preserve">2. Précisez les moyens utilisés :</w:t>
             </w:r>
           </w:p>
         </w:tc>
@@ -6079,7 +6204,7 @@
               <w:pStyle w:val="ListParagraph"/>
               <w:numPr>
                 <w:ilvl w:val="0"/>
-                <w:numId w:val="2"/>
+                <w:numId w:val="3"/>
               </w:numPr>
               <w:spacing w:after="40" w:before="0"/>
             </w:pPr>
@@ -6097,7 +6222,7 @@
               <w:pStyle w:val="ListParagraph"/>
               <w:numPr>
                 <w:ilvl w:val="0"/>
-                <w:numId w:val="2"/>
+                <w:numId w:val="3"/>
               </w:numPr>
               <w:spacing w:after="40" w:before="0"/>
             </w:pPr>
@@ -6107,7 +6232,7 @@
                 <w:sz w:val="20"/>
                 <w:szCs w:val="20"/>
               </w:rPr>
-              <w:t xml:space="preserve">Vercel (CI/CD integre, preview deployments, mise en production automatique)</w:t>
+              <w:t xml:space="preserve">Vercel (CI/CD intégré, preview deployments, mise en production automatique)</w:t>
             </w:r>
           </w:p>
           <w:p>
@@ -6115,7 +6240,7 @@
               <w:pStyle w:val="ListParagraph"/>
               <w:numPr>
                 <w:ilvl w:val="0"/>
-                <w:numId w:val="2"/>
+                <w:numId w:val="3"/>
               </w:numPr>
               <w:spacing w:after="40" w:before="0"/>
             </w:pPr>
@@ -6222,7 +6347,7 @@
                 <w:sz w:val="20"/>
                 <w:szCs w:val="20"/>
               </w:rPr>
-              <w:t xml:space="preserve">3. Avec qui avez-vous travaille ?</w:t>
+              <w:t xml:space="preserve">3. Avec qui avez-vous travaillé ?</w:t>
             </w:r>
           </w:p>
         </w:tc>
@@ -6277,7 +6402,7 @@
                 <w:sz w:val="20"/>
                 <w:szCs w:val="20"/>
               </w:rPr>
-              <w:t xml:space="preserve">Projet associatif realise pour le reseau AVanCe (AVC, CH Auxerre).</w:t>
+              <w:t xml:space="preserve">Projet associatif réalisé pour le réseau AVanCe (AVC, Centre Hospitalier d'Auxerre).</w:t>
             </w:r>
           </w:p>
           <w:p>
@@ -6422,15 +6547,15 @@
                 <w:sz w:val="20"/>
                 <w:szCs w:val="20"/>
               </w:rPr>
-              <w:t xml:space="preserve">Cadre (entreprise, organisme, association ou projet) : </w:t>
-            </w:r>
-            <w:r>
-              <w:rPr>
-                <w:rFonts w:ascii="Arial" w:cs="Arial" w:eastAsia="Arial" w:hAnsi="Arial"/>
-                <w:sz w:val="20"/>
-                <w:szCs w:val="20"/>
-              </w:rPr>
-              <w:t xml:space="preserve">Projet associatif — reseau AVanCe (AVC, CH Auxerre)</w:t>
+              <w:t xml:space="preserve">Nom de l'entreprise, organisme ou association : </w:t>
+            </w:r>
+            <w:r>
+              <w:rPr>
+                <w:rFonts w:ascii="Arial" w:cs="Arial" w:eastAsia="Arial" w:hAnsi="Arial"/>
+                <w:sz w:val="20"/>
+                <w:szCs w:val="20"/>
+              </w:rPr>
+              <w:t xml:space="preserve">Projet associatif — réseau AVanCe (AVC, CH Auxerre)</w:t>
             </w:r>
           </w:p>
           <w:p>
@@ -6442,15 +6567,15 @@
                 <w:sz w:val="20"/>
                 <w:szCs w:val="20"/>
               </w:rPr>
-              <w:t xml:space="preserve">Contexte / projet : </w:t>
-            </w:r>
-            <w:r>
-              <w:rPr>
-                <w:rFonts w:ascii="Arial" w:cs="Arial" w:eastAsia="Arial" w:hAnsi="Arial"/>
-                <w:sz w:val="20"/>
-                <w:szCs w:val="20"/>
-              </w:rPr>
-              <w:t xml:space="preserve">avance-web — site web officiel du reseau</w:t>
+              <w:t xml:space="preserve">Chantier, atelier, service : </w:t>
+            </w:r>
+            <w:r>
+              <w:rPr>
+                <w:rFonts w:ascii="Arial" w:cs="Arial" w:eastAsia="Arial" w:hAnsi="Arial"/>
+                <w:sz w:val="20"/>
+                <w:szCs w:val="20"/>
+              </w:rPr>
+              <w:t xml:space="preserve">avance-web — site web officiel du réseau</w:t>
             </w:r>
           </w:p>
           <w:p>
@@ -6462,7 +6587,7 @@
                 <w:sz w:val="20"/>
                 <w:szCs w:val="20"/>
               </w:rPr>
-              <w:t xml:space="preserve">Periode : Du </w:t>
+              <w:t xml:space="preserve">Période d'exercice : Du </w:t>
             </w:r>
             <w:r>
               <w:rPr>
@@ -6558,7 +6683,7 @@
                 <w:sz w:val="20"/>
                 <w:szCs w:val="20"/>
               </w:rPr>
-              <w:t xml:space="preserve">5. Informations complementaires (facultatif)</w:t>
+              <w:t xml:space="preserve">5. Informations complémentaires (facultatif)</w:t>
             </w:r>
           </w:p>
         </w:tc>
@@ -6694,7 +6819,7 @@
                 <w:sz w:val="22"/>
                 <w:szCs w:val="22"/>
               </w:rPr>
-              <w:t xml:space="preserve">Activite-type : Superviser les services deployes</w:t>
+              <w:t xml:space="preserve">Activité-type : Superviser les services déployés</w:t>
             </w:r>
           </w:p>
         </w:tc>
@@ -6808,7 +6933,7 @@
                 <w:sz w:val="20"/>
                 <w:szCs w:val="20"/>
               </w:rPr>
-              <w:t xml:space="preserve">1. Decrivez les taches ou operations que vous avez effectuees, et dans quelles conditions :</w:t>
+              <w:t xml:space="preserve">1. Décrivez les tâches ou opérations que vous avez effectuées, et dans quelles conditions :</w:t>
             </w:r>
           </w:p>
         </w:tc>
@@ -6863,7 +6988,7 @@
                 <w:sz w:val="20"/>
                 <w:szCs w:val="20"/>
               </w:rPr>
-              <w:t xml:space="preserve">J'ai mis en place une supervision complete de l'infrastructure WordPress et de ses services :</w:t>
+              <w:t xml:space="preserve">J'ai mis en place une supervision complète de l'infrastructure WordPress et de ses services :</w:t>
             </w:r>
           </w:p>
           <w:p>
@@ -6871,7 +6996,7 @@
               <w:pStyle w:val="ListParagraph"/>
               <w:numPr>
                 <w:ilvl w:val="0"/>
-                <w:numId w:val="2"/>
+                <w:numId w:val="3"/>
               </w:numPr>
               <w:spacing w:after="40" w:before="0"/>
             </w:pPr>
@@ -6881,7 +7006,7 @@
                 <w:sz w:val="20"/>
                 <w:szCs w:val="20"/>
               </w:rPr>
-              <w:t xml:space="preserve">Collecte de metriques avec Prometheus (scraping : node-exporter pour le systeme, mysqld-exporter pour la base WordPress, alertmanager) ;</w:t>
+              <w:t xml:space="preserve">Collecte de métriques avec Prometheus (scraping : node-exporter pour le système, mysqld-exporter pour la base WordPress, alertmanager) ;</w:t>
             </w:r>
           </w:p>
           <w:p>
@@ -6889,7 +7014,7 @@
               <w:pStyle w:val="ListParagraph"/>
               <w:numPr>
                 <w:ilvl w:val="0"/>
-                <w:numId w:val="2"/>
+                <w:numId w:val="3"/>
               </w:numPr>
               <w:spacing w:after="40" w:before="0"/>
             </w:pPr>
@@ -6899,7 +7024,7 @@
                 <w:sz w:val="20"/>
                 <w:szCs w:val="20"/>
               </w:rPr>
-              <w:t xml:space="preserve">Visualisation temps reel avec Grafana (dashboard auto-provisionne : CPU, RAM, uptime) ;</w:t>
+              <w:t xml:space="preserve">Visualisation en temps réel avec Grafana (tableau de bord auto-provisionné : CPU, RAM, uptime) ;</w:t>
             </w:r>
           </w:p>
           <w:p>
@@ -6907,7 +7032,7 @@
               <w:pStyle w:val="ListParagraph"/>
               <w:numPr>
                 <w:ilvl w:val="0"/>
-                <w:numId w:val="2"/>
+                <w:numId w:val="3"/>
               </w:numPr>
               <w:spacing w:after="40" w:before="0"/>
             </w:pPr>
@@ -6917,7 +7042,7 @@
                 <w:sz w:val="20"/>
                 <w:szCs w:val="20"/>
               </w:rPr>
-              <w:t xml:space="preserve">Definition de 3 regles d'alertes en PromQL : HighCPUUsage, HighMemoryUsage, NginxDown ;</w:t>
+              <w:t xml:space="preserve">Définition de trois règles d'alertes en PromQL : HighCPUUsage, HighMemoryUsage, NginxDown ;</w:t>
             </w:r>
           </w:p>
           <w:p>
@@ -6925,7 +7050,7 @@
               <w:pStyle w:val="ListParagraph"/>
               <w:numPr>
                 <w:ilvl w:val="0"/>
-                <w:numId w:val="2"/>
+                <w:numId w:val="3"/>
               </w:numPr>
               <w:spacing w:after="40" w:before="0"/>
             </w:pPr>
@@ -6935,7 +7060,7 @@
                 <w:sz w:val="20"/>
                 <w:szCs w:val="20"/>
               </w:rPr>
-              <w:t xml:space="preserve">Routage des alertes par Alertmanager vers Discord, via un micro-relay Python (discord_relay.py) que j'ai developpe pour traduire le format Alertmanager au format natif Discord ;</w:t>
+              <w:t xml:space="preserve">Routage des alertes par Alertmanager vers Discord, via un micro-relais Python (discord_relay.py) que j'ai développé pour traduire le format Alertmanager au format natif Discord ;</w:t>
             </w:r>
           </w:p>
           <w:p>
@@ -6943,7 +7068,7 @@
               <w:pStyle w:val="ListParagraph"/>
               <w:numPr>
                 <w:ilvl w:val="0"/>
-                <w:numId w:val="2"/>
+                <w:numId w:val="3"/>
               </w:numPr>
               <w:spacing w:after="40" w:before="0"/>
             </w:pPr>
@@ -6953,7 +7078,7 @@
                 <w:sz w:val="20"/>
                 <w:szCs w:val="20"/>
               </w:rPr>
-              <w:t xml:space="preserve">Test de bout en bout valide : arret d'un service -&gt; alerte recue sur Discord (HTTP 204).</w:t>
+              <w:t xml:space="preserve">Test de bout en bout validé : arrêt d'un service puis réception de l'alerte sur Discord (réponse HTTP 204).</w:t>
             </w:r>
           </w:p>
           <w:p>
@@ -7059,7 +7184,7 @@
                 <w:sz w:val="20"/>
                 <w:szCs w:val="20"/>
               </w:rPr>
-              <w:t xml:space="preserve">2. Precisez les moyens utilises :</w:t>
+              <w:t xml:space="preserve">2. Précisez les moyens utilisés :</w:t>
             </w:r>
           </w:p>
         </w:tc>
@@ -7103,7 +7228,7 @@
               <w:pStyle w:val="ListParagraph"/>
               <w:numPr>
                 <w:ilvl w:val="0"/>
-                <w:numId w:val="2"/>
+                <w:numId w:val="3"/>
               </w:numPr>
               <w:spacing w:after="40" w:before="0"/>
             </w:pPr>
@@ -7113,7 +7238,7 @@
                 <w:sz w:val="20"/>
                 <w:szCs w:val="20"/>
               </w:rPr>
-              <w:t xml:space="preserve">Prometheus (scrape configs, PromQL, alerting rules)</w:t>
+              <w:t xml:space="preserve">Prometheus (scrape configs, PromQL, règles d'alertes)</w:t>
             </w:r>
           </w:p>
           <w:p>
@@ -7121,7 +7246,7 @@
               <w:pStyle w:val="ListParagraph"/>
               <w:numPr>
                 <w:ilvl w:val="0"/>
-                <w:numId w:val="2"/>
+                <w:numId w:val="3"/>
               </w:numPr>
               <w:spacing w:after="40" w:before="0"/>
             </w:pPr>
@@ -7131,7 +7256,7 @@
                 <w:sz w:val="20"/>
                 <w:szCs w:val="20"/>
               </w:rPr>
-              <w:t xml:space="preserve">Grafana (provisioning datasource + dashboard)</w:t>
+              <w:t xml:space="preserve">Grafana (provisioning de la source de données et du tableau de bord)</w:t>
             </w:r>
           </w:p>
           <w:p>
@@ -7139,7 +7264,7 @@
               <w:pStyle w:val="ListParagraph"/>
               <w:numPr>
                 <w:ilvl w:val="0"/>
-                <w:numId w:val="2"/>
+                <w:numId w:val="3"/>
               </w:numPr>
               <w:spacing w:after="40" w:before="0"/>
             </w:pPr>
@@ -7149,7 +7274,7 @@
                 <w:sz w:val="20"/>
                 <w:szCs w:val="20"/>
               </w:rPr>
-              <w:t xml:space="preserve">Alertmanager (routing, inhibit rules), mysqld-exporter, node-exporter</w:t>
+              <w:t xml:space="preserve">Alertmanager (routage, règles d'inhibition), mysqld-exporter, node-exporter</w:t>
             </w:r>
           </w:p>
           <w:p>
@@ -7157,7 +7282,7 @@
               <w:pStyle w:val="ListParagraph"/>
               <w:numPr>
                 <w:ilvl w:val="0"/>
-                <w:numId w:val="2"/>
+                <w:numId w:val="3"/>
               </w:numPr>
               <w:spacing w:after="40" w:before="0"/>
             </w:pPr>
@@ -7255,7 +7380,7 @@
                 <w:sz w:val="20"/>
                 <w:szCs w:val="20"/>
               </w:rPr>
-              <w:t xml:space="preserve">3. Avec qui avez-vous travaille ?</w:t>
+              <w:t xml:space="preserve">3. Avec qui avez-vous travaillé ?</w:t>
             </w:r>
           </w:p>
         </w:tc>
@@ -7310,7 +7435,7 @@
                 <w:sz w:val="20"/>
                 <w:szCs w:val="20"/>
               </w:rPr>
-              <w:t xml:space="preserve">Projet de formation realise en autonomie, valide lors des bilans de sprint.</w:t>
+              <w:t xml:space="preserve">Projet de formation réalisé en autonomie, validé lors des bilans de sprint.</w:t>
             </w:r>
           </w:p>
           <w:p>
@@ -7455,15 +7580,15 @@
                 <w:sz w:val="20"/>
                 <w:szCs w:val="20"/>
               </w:rPr>
-              <w:t xml:space="preserve">Cadre (entreprise, organisme, association ou projet) : </w:t>
-            </w:r>
-            <w:r>
-              <w:rPr>
-                <w:rFonts w:ascii="Arial" w:cs="Arial" w:eastAsia="Arial" w:hAnsi="Arial"/>
-                <w:sz w:val="20"/>
-                <w:szCs w:val="20"/>
-              </w:rPr>
-              <w:t xml:space="preserve">Ecole IT d'Orleans</w:t>
+              <w:t xml:space="preserve">Nom de l'entreprise, organisme ou association : </w:t>
+            </w:r>
+            <w:r>
+              <w:rPr>
+                <w:rFonts w:ascii="Arial" w:cs="Arial" w:eastAsia="Arial" w:hAnsi="Arial"/>
+                <w:sz w:val="20"/>
+                <w:szCs w:val="20"/>
+              </w:rPr>
+              <w:t xml:space="preserve">École IT d'Orléans</w:t>
             </w:r>
           </w:p>
           <w:p>
@@ -7475,7 +7600,7 @@
                 <w:sz w:val="20"/>
                 <w:szCs w:val="20"/>
               </w:rPr>
-              <w:t xml:space="preserve">Contexte / projet : </w:t>
+              <w:t xml:space="preserve">Chantier, atelier, service : </w:t>
             </w:r>
             <w:r>
               <w:rPr>
@@ -7495,7 +7620,7 @@
                 <w:sz w:val="20"/>
                 <w:szCs w:val="20"/>
               </w:rPr>
-              <w:t xml:space="preserve">Periode : Du </w:t>
+              <w:t xml:space="preserve">Période d'exercice : Du </w:t>
             </w:r>
             <w:r>
               <w:rPr>
@@ -7591,7 +7716,7 @@
                 <w:sz w:val="20"/>
                 <w:szCs w:val="20"/>
               </w:rPr>
-              <w:t xml:space="preserve">5. Informations complementaires (facultatif)</w:t>
+              <w:t xml:space="preserve">5. Informations complémentaires (facultatif)</w:t>
             </w:r>
           </w:p>
         </w:tc>
@@ -7727,7 +7852,7 @@
                 <w:sz w:val="22"/>
                 <w:szCs w:val="22"/>
               </w:rPr>
-              <w:t xml:space="preserve">Activite-type : Superviser les services deployes</w:t>
+              <w:t xml:space="preserve">Activité-type : Superviser les services déployés</w:t>
             </w:r>
           </w:p>
         </w:tc>
@@ -7771,7 +7896,7 @@
                 <w:sz w:val="20"/>
                 <w:szCs w:val="20"/>
               </w:rPr>
-              <w:t xml:space="preserve">dropshop — Observabilite applicative sur AWS (projet personnel)</w:t>
+              <w:t xml:space="preserve">dropshop — Observabilité applicative sur AWS (projet personnel)</w:t>
             </w:r>
           </w:p>
         </w:tc>
@@ -7841,7 +7966,7 @@
                 <w:sz w:val="20"/>
                 <w:szCs w:val="20"/>
               </w:rPr>
-              <w:t xml:space="preserve">1. Decrivez les taches ou operations que vous avez effectuees, et dans quelles conditions :</w:t>
+              <w:t xml:space="preserve">1. Décrivez les tâches ou opérations que vous avez effectuées, et dans quelles conditions :</w:t>
             </w:r>
           </w:p>
         </w:tc>
@@ -7896,7 +8021,7 @@
                 <w:sz w:val="20"/>
                 <w:szCs w:val="20"/>
               </w:rPr>
-              <w:t xml:space="preserve">Pour l'application dropshop deployee sur AWS, j'ai mis en place l'observabilite des services en production :</w:t>
+              <w:t xml:space="preserve">Pour l'application dropshop déployée sur AWS, j'ai mis en place l'observabilité des services en production :</w:t>
             </w:r>
           </w:p>
           <w:p>
@@ -7904,7 +8029,7 @@
               <w:pStyle w:val="ListParagraph"/>
               <w:numPr>
                 <w:ilvl w:val="0"/>
-                <w:numId w:val="2"/>
+                <w:numId w:val="3"/>
               </w:numPr>
               <w:spacing w:after="40" w:before="0"/>
             </w:pPr>
@@ -7914,7 +8039,7 @@
                 <w:sz w:val="20"/>
                 <w:szCs w:val="20"/>
               </w:rPr>
-              <w:t xml:space="preserve">Journalisation centralisee : sortie des logs Gunicorn (access + error) et des workers Celery sur la sortie standard, collectee par ECS / CloudWatch Logs ;</w:t>
+              <w:t xml:space="preserve">Journalisation centralisée : sortie des logs Gunicorn (accès et erreurs) et des workers Celery sur la sortie standard, collectée par ECS / CloudWatch Logs ;</w:t>
             </w:r>
           </w:p>
           <w:p>
@@ -7922,7 +8047,7 @@
               <w:pStyle w:val="ListParagraph"/>
               <w:numPr>
                 <w:ilvl w:val="0"/>
-                <w:numId w:val="2"/>
+                <w:numId w:val="3"/>
               </w:numPr>
               <w:spacing w:after="40" w:before="0"/>
             </w:pPr>
@@ -7932,7 +8057,7 @@
                 <w:sz w:val="20"/>
                 <w:szCs w:val="20"/>
               </w:rPr>
-              <w:t xml:space="preserve">Suivi de l'etat des services ECS et attente de stabilisation apres deploiement ;</w:t>
+              <w:t xml:space="preserve">Suivi de l'état des services ECS et attente de stabilisation après chaque déploiement ;</w:t>
             </w:r>
           </w:p>
           <w:p>
@@ -7940,7 +8065,7 @@
               <w:pStyle w:val="ListParagraph"/>
               <w:numPr>
                 <w:ilvl w:val="0"/>
-                <w:numId w:val="2"/>
+                <w:numId w:val="3"/>
               </w:numPr>
               <w:spacing w:after="40" w:before="0"/>
             </w:pPr>
@@ -7950,7 +8075,7 @@
                 <w:sz w:val="20"/>
                 <w:szCs w:val="20"/>
               </w:rPr>
-              <w:t xml:space="preserve">Controle du code de sortie des taches de migration (echec du deploiement si la migration echoue) ;</w:t>
+              <w:t xml:space="preserve">Contrôle du code de sortie des tâches de migration (échec du déploiement si la migration échoue) ;</w:t>
             </w:r>
           </w:p>
           <w:p>
@@ -7958,7 +8083,7 @@
               <w:pStyle w:val="ListParagraph"/>
               <w:numPr>
                 <w:ilvl w:val="0"/>
-                <w:numId w:val="2"/>
+                <w:numId w:val="3"/>
               </w:numPr>
               <w:spacing w:after="40" w:before="0"/>
             </w:pPr>
@@ -7968,7 +8093,7 @@
                 <w:sz w:val="20"/>
                 <w:szCs w:val="20"/>
               </w:rPr>
-              <w:t xml:space="preserve">Resume de deploiement genere automatiquement dans GitHub Actions (commit, images deployees).</w:t>
+              <w:t xml:space="preserve">Résumé de déploiement généré automatiquement dans GitHub Actions (commit, images déployées).</w:t>
             </w:r>
           </w:p>
           <w:p>
@@ -8083,7 +8208,7 @@
                 <w:sz w:val="20"/>
                 <w:szCs w:val="20"/>
               </w:rPr>
-              <w:t xml:space="preserve">2. Precisez les moyens utilises :</w:t>
+              <w:t xml:space="preserve">2. Précisez les moyens utilisés :</w:t>
             </w:r>
           </w:p>
         </w:tc>
@@ -8127,7 +8252,7 @@
               <w:pStyle w:val="ListParagraph"/>
               <w:numPr>
                 <w:ilvl w:val="0"/>
-                <w:numId w:val="2"/>
+                <w:numId w:val="3"/>
               </w:numPr>
               <w:spacing w:after="40" w:before="0"/>
             </w:pPr>
@@ -8137,7 +8262,7 @@
                 <w:sz w:val="20"/>
                 <w:szCs w:val="20"/>
               </w:rPr>
-              <w:t xml:space="preserve">AWS ECS (etat des services), CloudWatch Logs</w:t>
+              <w:t xml:space="preserve">AWS ECS (état des services), CloudWatch Logs</w:t>
             </w:r>
           </w:p>
           <w:p>
@@ -8145,7 +8270,7 @@
               <w:pStyle w:val="ListParagraph"/>
               <w:numPr>
                 <w:ilvl w:val="0"/>
-                <w:numId w:val="2"/>
+                <w:numId w:val="3"/>
               </w:numPr>
               <w:spacing w:after="40" w:before="0"/>
             </w:pPr>
@@ -8155,7 +8280,7 @@
                 <w:sz w:val="20"/>
                 <w:szCs w:val="20"/>
               </w:rPr>
-              <w:t xml:space="preserve">Gunicorn (access/error logs), Celery</w:t>
+              <w:t xml:space="preserve">Gunicorn (logs d'accès et d'erreurs), Celery</w:t>
             </w:r>
           </w:p>
           <w:p>
@@ -8163,7 +8288,7 @@
               <w:pStyle w:val="ListParagraph"/>
               <w:numPr>
                 <w:ilvl w:val="0"/>
-                <w:numId w:val="2"/>
+                <w:numId w:val="3"/>
               </w:numPr>
               <w:spacing w:after="40" w:before="0"/>
             </w:pPr>
@@ -8270,7 +8395,7 @@
                 <w:sz w:val="20"/>
                 <w:szCs w:val="20"/>
               </w:rPr>
-              <w:t xml:space="preserve">3. Avec qui avez-vous travaille ?</w:t>
+              <w:t xml:space="preserve">3. Avec qui avez-vous travaillé ?</w:t>
             </w:r>
           </w:p>
         </w:tc>
@@ -8325,7 +8450,7 @@
                 <w:sz w:val="20"/>
                 <w:szCs w:val="20"/>
               </w:rPr>
-              <w:t xml:space="preserve">Projet personnel realise en autonomie.</w:t>
+              <w:t xml:space="preserve">Projet personnel réalisé en autonomie.</w:t>
             </w:r>
           </w:p>
           <w:p>
@@ -8470,7 +8595,7 @@
                 <w:sz w:val="20"/>
                 <w:szCs w:val="20"/>
               </w:rPr>
-              <w:t xml:space="preserve">Cadre (entreprise, organisme, association ou projet) : </w:t>
+              <w:t xml:space="preserve">Nom de l'entreprise, organisme ou association : </w:t>
             </w:r>
             <w:r>
               <w:rPr>
@@ -8490,15 +8615,15 @@
                 <w:sz w:val="20"/>
                 <w:szCs w:val="20"/>
               </w:rPr>
-              <w:t xml:space="preserve">Contexte / projet : </w:t>
-            </w:r>
-            <w:r>
-              <w:rPr>
-                <w:rFonts w:ascii="Arial" w:cs="Arial" w:eastAsia="Arial" w:hAnsi="Arial"/>
-                <w:sz w:val="20"/>
-                <w:szCs w:val="20"/>
-              </w:rPr>
-              <w:t xml:space="preserve">dropshop — observabilite et fiabilite du deploiement</w:t>
+              <w:t xml:space="preserve">Chantier, atelier, service : </w:t>
+            </w:r>
+            <w:r>
+              <w:rPr>
+                <w:rFonts w:ascii="Arial" w:cs="Arial" w:eastAsia="Arial" w:hAnsi="Arial"/>
+                <w:sz w:val="20"/>
+                <w:szCs w:val="20"/>
+              </w:rPr>
+              <w:t xml:space="preserve">dropshop — observabilité et fiabilité du déploiement</w:t>
             </w:r>
           </w:p>
           <w:p>
@@ -8510,7 +8635,7 @@
                 <w:sz w:val="20"/>
                 <w:szCs w:val="20"/>
               </w:rPr>
-              <w:t xml:space="preserve">Periode : Du </w:t>
+              <w:t xml:space="preserve">Période d'exercice : Du </w:t>
             </w:r>
             <w:r>
               <w:rPr>
@@ -8606,7 +8731,7 @@
                 <w:sz w:val="20"/>
                 <w:szCs w:val="20"/>
               </w:rPr>
-              <w:t xml:space="preserve">5. Informations complementaires (facultatif)</w:t>
+              <w:t xml:space="preserve">5. Informations complémentaires (facultatif)</w:t>
             </w:r>
           </w:p>
         </w:tc>
@@ -8772,7 +8897,7 @@
                 <w:sz w:val="24"/>
                 <w:szCs w:val="24"/>
               </w:rPr>
-              <w:t xml:space="preserve">Titres, diplomes, certifications</w:t>
+              <w:t xml:space="preserve">Titres, diplômes, certifications</w:t>
             </w:r>
           </w:p>
         </w:tc>
@@ -8848,7 +8973,7 @@
                 <w:sz w:val="20"/>
                 <w:szCs w:val="20"/>
               </w:rPr>
-              <w:t xml:space="preserve">Intitule</w:t>
+              <w:t xml:space="preserve">Intitulé</w:t>
             </w:r>
           </w:p>
         </w:tc>
@@ -8996,7 +9121,7 @@
                 <w:sz w:val="20"/>
                 <w:szCs w:val="20"/>
               </w:rPr>
-              <w:t xml:space="preserve">Universite de Douala (Cameroun)</w:t>
+              <w:t xml:space="preserve">Université de Douala (Cameroun)</w:t>
             </w:r>
           </w:p>
         </w:tc>
@@ -9180,7 +9305,7 @@
                 <w:sz w:val="20"/>
                 <w:szCs w:val="20"/>
               </w:rPr>
-              <w:t xml:space="preserve">Bachelor 3 Systemes d'Information (en cours)</w:t>
+              <w:t xml:space="preserve">Bachelor 3 Systèmes d'Information (en cours)</w:t>
             </w:r>
           </w:p>
         </w:tc>
@@ -9216,7 +9341,7 @@
                 <w:sz w:val="20"/>
                 <w:szCs w:val="20"/>
               </w:rPr>
-              <w:t xml:space="preserve">Ecole IT d'Orleans</w:t>
+              <w:t xml:space="preserve">École IT d'Orléans</w:t>
             </w:r>
           </w:p>
         </w:tc>
@@ -9556,7 +9681,7 @@
                 <w:sz w:val="24"/>
                 <w:szCs w:val="24"/>
               </w:rPr>
-              <w:t xml:space="preserve">Declaration sur l'honneur</w:t>
+              <w:t xml:space="preserve">Déclaration sur l'honneur</w:t>
             </w:r>
           </w:p>
         </w:tc>
@@ -9614,7 +9739,7 @@
           <w:sz w:val="20"/>
           <w:szCs w:val="20"/>
         </w:rPr>
-        <w:t xml:space="preserve">Je soussigne(e) Loic NANZO TONLIEU,</w:t>
+        <w:t xml:space="preserve">Je soussigné Loïc NANZO TONLIEU,</w:t>
       </w:r>
     </w:p>
     <w:p>
@@ -9633,7 +9758,7 @@
           <w:sz w:val="20"/>
           <w:szCs w:val="20"/>
         </w:rPr>
-        <w:t xml:space="preserve">declare sur l'honneur que les renseignements fournis dans ce dossier sont exacts et que je</w:t>
+        <w:t xml:space="preserve">déclare sur l'honneur que les renseignements fournis dans ce dossier sont exacts et que je</w:t>
       </w:r>
     </w:p>
     <w:p>
@@ -9652,7 +9777,7 @@
           <w:sz w:val="20"/>
           <w:szCs w:val="20"/>
         </w:rPr>
-        <w:t xml:space="preserve">suis l'auteur des realisations jointes.</w:t>
+        <w:t xml:space="preserve">suis l'auteur des réalisations jointes.</w:t>
       </w:r>
     </w:p>
     <w:p>
@@ -9671,7 +9796,7 @@
           <w:sz w:val="20"/>
           <w:szCs w:val="20"/>
         </w:rPr>
-        <w:t xml:space="preserve">Fait a  Orleans                                    le  _______________</w:t>
+        <w:t xml:space="preserve">Fait à  Orléans                                    le  _______________</w:t>
       </w:r>
     </w:p>
     <w:p>
@@ -9809,7 +9934,7 @@
           <w:sz w:val="20"/>
           <w:szCs w:val="20"/>
         </w:rPr>
-        <w:t xml:space="preserve">(liens vers les depots de code)</w:t>
+        <w:t xml:space="preserve">(liens vers les dépôts de code)</w:t>
       </w:r>
     </w:p>
     <w:tbl>
@@ -9902,7 +10027,7 @@
                 <w:sz w:val="20"/>
                 <w:szCs w:val="20"/>
               </w:rPr>
-              <w:t xml:space="preserve">dropshop (perso) — Docker + CI/CD AWS ECS : github.com/pilot-loicrich/dropshop</w:t>
+              <w:t xml:space="preserve">dropshop (personnel) — Docker + CI/CD AWS ECS : github.com/pilot-loicrich/dropshop</w:t>
             </w:r>
           </w:p>
         </w:tc>
@@ -9940,7 +10065,7 @@
                 <w:sz w:val="20"/>
                 <w:szCs w:val="20"/>
               </w:rPr>
-              <w:t xml:space="preserve">chatbot-rag (perso) — Docker + GitLab CI : github.com/pilot-loicrich/chatbot-rag</w:t>
+              <w:t xml:space="preserve">chatbot-rag (personnel) — Docker + GitLab CI : github.com/pilot-loicrich/chatbot-rag</w:t>
             </w:r>
           </w:p>
         </w:tc>
@@ -10016,7 +10141,7 @@
                 <w:sz w:val="20"/>
                 <w:szCs w:val="20"/>
               </w:rPr>
-              <w:t xml:space="preserve">FinanceManager (groupe, hackathon ecole) — Django + PostgreSQL : github.com/pilot-loicrich/FinanceManager_Hackathon</w:t>
+              <w:t xml:space="preserve">FinanceManager (groupe, hackathon école) — Django + PostgreSQL : github.com/pilot-loicrich/FinanceManager_Hackathon</w:t>
             </w:r>
           </w:p>
         </w:tc>
@@ -10092,7 +10217,7 @@
                 <w:sz w:val="20"/>
                 <w:szCs w:val="20"/>
               </w:rPr>
-              <w:t xml:space="preserve">portfolio-ecole-it — projets et competences de formation : github.com/pilot-loicrich/portfolio-ecole-it</w:t>
+              <w:t xml:space="preserve">portfolio-ecole-it — projets et compétences de formation : github.com/pilot-loicrich/portfolio-ecole-it</w:t>
             </w:r>
           </w:p>
         </w:tc>
@@ -10130,7 +10255,7 @@
                 <w:sz w:val="20"/>
                 <w:szCs w:val="20"/>
               </w:rPr>
-              <w:t xml:space="preserve">Captures d'ecran : dashboard Grafana, pipelines CI/CD verts, notification Discord</w:t>
+              <w:t xml:space="preserve">Captures d'écran : tableau de bord Grafana, pipelines CI/CD au vert, notification Discord</w:t>
             </w:r>
           </w:p>
         </w:tc>
@@ -10404,6 +10529,12 @@
     </w:lvlOverride>
   </w:num>
   <w:num w:numId="2">
+    <w:abstractNumId w:val="3"/>
+    <w:lvlOverride w:ilvl="0">
+      <w:startOverride w:val="1"/>
+    </w:lvlOverride>
+  </w:num>
+  <w:num w:numId="3">
     <w:abstractNumId w:val="2"/>
     <w:lvlOverride w:ilvl="0">
       <w:startOverride w:val="1"/>

</xml_diff>